<commit_message>
fix: Bechtle-Empfehlung auf 1 Hub (GWC) korrigiert
Template: Sekundären Hub-Block (northeurope) aus main.bicepparam entfernt;
war aktiv konfiguriert und hätte beim Deploy ein leeres NE-VNet erstellt.
Kommentar-Hinweis auf Variante D bleibt als Orientierung.

Referenzdokument §6.2/§6.3: 'GWC + NE' → 'GWC', Firewall Premium → Standard,
ExpressRoute/DDoS/Sekundär-Hub als 'Zurückgestellt' bzw. 'Nur Variante D' markiert.

Co-Authored-By: Claude Sonnet 4.6 <noreply@anthropic.com>
Claude-Session: https://claude.ai/code/session_01DSkzcxBS9BsVaThtWgrZPV
</commit_message>
<xml_diff>
--- a/docs/konzept/Word/Azure-Landing-Zone-ALZ-Referenz.docx
+++ b/docs/konzept/Word/Azure-Landing-Zone-ALZ-Referenz.docx
@@ -17311,6 +17311,16 @@
         <w:t>6.2 Logging &amp; Monitoring Module</w:t>
       </w:r>
     </w:p>
+    <w:p>
+      <w:pPr/>
+      <w:r>
+        <w:rPr>
+          <w:color w:val="595959"/>
+          <w:sz w:val="20"/>
+        </w:rPr>
+        <w:t>Bechtle-Empfehlung: 1 Region (GWC). Alle Logging-Ressourcen werden einmalig in der Primärregion Germany West Central deployt.</w:t>
+      </w:r>
+    </w:p>
     <w:tbl>
       <w:tblPr>
         <w:tblStyle w:val="TableGrid"/>
@@ -17342,7 +17352,7 @@
         </w:tc>
         <w:tc>
           <w:tcPr>
-            <w:tcW w:type="dxa" w:w="3168"/>
+            <w:tcW w:type="dxa" w:w="3744"/>
             <w:shd w:val="clear" w:color="auto" w:fill="053B25"/>
           </w:tcPr>
           <w:p>
@@ -17358,7 +17368,7 @@
         </w:tc>
         <w:tc>
           <w:tcPr>
-            <w:tcW w:type="dxa" w:w="3600"/>
+            <w:tcW w:type="dxa" w:w="3312"/>
             <w:shd w:val="clear" w:color="auto" w:fill="053B25"/>
           </w:tcPr>
           <w:p>
@@ -17374,7 +17384,7 @@
         </w:tc>
         <w:tc>
           <w:tcPr>
-            <w:tcW w:type="dxa" w:w="1584"/>
+            <w:tcW w:type="dxa" w:w="1296"/>
             <w:shd w:val="clear" w:color="auto" w:fill="053B25"/>
           </w:tcPr>
           <w:p>
@@ -17407,46 +17417,108 @@
         </w:tc>
         <w:tc>
           <w:tcPr>
+            <w:tcW w:type="dxa" w:w="3744"/>
+            <w:shd w:val="clear" w:color="auto" w:fill="F2F9F5"/>
+          </w:tcPr>
+          <w:p>
+            <w:r>
+              <w:rPr>
+                <w:color w:val="595959"/>
+                <w:sz w:val="18"/>
+              </w:rPr>
+              <w:t>law-alz-germanywestcentral</w:t>
+            </w:r>
+          </w:p>
+        </w:tc>
+        <w:tc>
+          <w:tcPr>
+            <w:tcW w:type="dxa" w:w="3312"/>
+            <w:shd w:val="clear" w:color="auto" w:fill="F2F9F5"/>
+          </w:tcPr>
+          <w:p>
+            <w:r>
+              <w:rPr>
+                <w:color w:val="595959"/>
+                <w:sz w:val="18"/>
+              </w:rPr>
+              <w:t>avm/res/operational-insights/workspace:0.9.0</w:t>
+            </w:r>
+          </w:p>
+        </w:tc>
+        <w:tc>
+          <w:tcPr>
+            <w:tcW w:type="dxa" w:w="1296"/>
+            <w:shd w:val="clear" w:color="auto" w:fill="F2F9F5"/>
+          </w:tcPr>
+          <w:p>
+            <w:r>
+              <w:rPr>
+                <w:color w:val="595959"/>
+                <w:sz w:val="18"/>
+              </w:rPr>
+              <w:t>GWC</w:t>
+            </w:r>
+          </w:p>
+        </w:tc>
+      </w:tr>
+      <w:tr>
+        <w:tc>
+          <w:tcPr>
             <w:tcW w:type="dxa" w:w="3168"/>
-            <w:shd w:val="clear" w:color="auto" w:fill="F2F9F5"/>
-          </w:tcPr>
-          <w:p>
-            <w:r>
-              <w:rPr>
-                <w:color w:val="595959"/>
-                <w:sz w:val="18"/>
-              </w:rPr>
-              <w:t>law-alz-&lt;region&gt;</w:t>
-            </w:r>
-          </w:p>
-        </w:tc>
-        <w:tc>
-          <w:tcPr>
-            <w:tcW w:type="dxa" w:w="3600"/>
-            <w:shd w:val="clear" w:color="auto" w:fill="F2F9F5"/>
-          </w:tcPr>
-          <w:p>
-            <w:r>
-              <w:rPr>
-                <w:color w:val="595959"/>
-                <w:sz w:val="18"/>
-              </w:rPr>
-              <w:t>avm/res/operational-insights/workspace:0.9.0</w:t>
-            </w:r>
-          </w:p>
-        </w:tc>
-        <w:tc>
-          <w:tcPr>
-            <w:tcW w:type="dxa" w:w="1584"/>
-            <w:shd w:val="clear" w:color="auto" w:fill="F2F9F5"/>
-          </w:tcPr>
-          <w:p>
-            <w:r>
-              <w:rPr>
-                <w:color w:val="595959"/>
-                <w:sz w:val="18"/>
-              </w:rPr>
-              <w:t>GWC + NE</w:t>
+            <w:shd w:val="clear" w:color="auto" w:fill="FFFFFF"/>
+          </w:tcPr>
+          <w:p>
+            <w:r>
+              <w:rPr>
+                <w:color w:val="595959"/>
+                <w:sz w:val="18"/>
+              </w:rPr>
+              <w:t>Managed Identity (AMA)</w:t>
+            </w:r>
+          </w:p>
+        </w:tc>
+        <w:tc>
+          <w:tcPr>
+            <w:tcW w:type="dxa" w:w="3744"/>
+            <w:shd w:val="clear" w:color="auto" w:fill="FFFFFF"/>
+          </w:tcPr>
+          <w:p>
+            <w:r>
+              <w:rPr>
+                <w:color w:val="595959"/>
+                <w:sz w:val="18"/>
+              </w:rPr>
+              <w:t>mi-alz-germanywestcentral</w:t>
+            </w:r>
+          </w:p>
+        </w:tc>
+        <w:tc>
+          <w:tcPr>
+            <w:tcW w:type="dxa" w:w="3312"/>
+            <w:shd w:val="clear" w:color="auto" w:fill="FFFFFF"/>
+          </w:tcPr>
+          <w:p>
+            <w:r>
+              <w:rPr>
+                <w:color w:val="595959"/>
+                <w:sz w:val="18"/>
+              </w:rPr>
+              <w:t>avm/res/managed-identity/user-assigned-identity</w:t>
+            </w:r>
+          </w:p>
+        </w:tc>
+        <w:tc>
+          <w:tcPr>
+            <w:tcW w:type="dxa" w:w="1296"/>
+            <w:shd w:val="clear" w:color="auto" w:fill="FFFFFF"/>
+          </w:tcPr>
+          <w:p>
+            <w:r>
+              <w:rPr>
+                <w:color w:val="595959"/>
+                <w:sz w:val="18"/>
+              </w:rPr>
+              <w:t>GWC</w:t>
             </w:r>
           </w:p>
         </w:tc>
@@ -17455,18 +17527,65 @@
         <w:tc>
           <w:tcPr>
             <w:tcW w:type="dxa" w:w="3168"/>
-            <w:shd w:val="clear" w:color="auto" w:fill="FFFFFF"/>
-          </w:tcPr>
-          <w:p>
-            <w:r>
-              <w:rPr>
-                <w:color w:val="595959"/>
-                <w:sz w:val="18"/>
-              </w:rPr>
-              <w:t>Managed Identity (AMA)</w:t>
-            </w:r>
-          </w:p>
-        </w:tc>
+            <w:shd w:val="clear" w:color="auto" w:fill="F2F9F5"/>
+          </w:tcPr>
+          <w:p>
+            <w:r>
+              <w:rPr>
+                <w:color w:val="595959"/>
+                <w:sz w:val="18"/>
+              </w:rPr>
+              <w:t>DCR – VM Insights</w:t>
+            </w:r>
+          </w:p>
+        </w:tc>
+        <w:tc>
+          <w:tcPr>
+            <w:tcW w:type="dxa" w:w="3744"/>
+            <w:shd w:val="clear" w:color="auto" w:fill="F2F9F5"/>
+          </w:tcPr>
+          <w:p>
+            <w:r>
+              <w:rPr>
+                <w:color w:val="595959"/>
+                <w:sz w:val="18"/>
+              </w:rPr>
+              <w:t>dcr-vmi-alz-germanywestcentral</w:t>
+            </w:r>
+          </w:p>
+        </w:tc>
+        <w:tc>
+          <w:tcPr>
+            <w:tcW w:type="dxa" w:w="3312"/>
+            <w:shd w:val="clear" w:color="auto" w:fill="F2F9F5"/>
+          </w:tcPr>
+          <w:p>
+            <w:r>
+              <w:rPr>
+                <w:color w:val="595959"/>
+                <w:sz w:val="18"/>
+              </w:rPr>
+              <w:t>avm/ptn/alz/ama:0.2.0</w:t>
+            </w:r>
+          </w:p>
+        </w:tc>
+        <w:tc>
+          <w:tcPr>
+            <w:tcW w:type="dxa" w:w="1296"/>
+            <w:shd w:val="clear" w:color="auto" w:fill="F2F9F5"/>
+          </w:tcPr>
+          <w:p>
+            <w:r>
+              <w:rPr>
+                <w:color w:val="595959"/>
+                <w:sz w:val="18"/>
+              </w:rPr>
+              <w:t>GWC</w:t>
+            </w:r>
+          </w:p>
+        </w:tc>
+      </w:tr>
+      <w:tr>
         <w:tc>
           <w:tcPr>
             <w:tcW w:type="dxa" w:w="3168"/>
@@ -17478,37 +17597,52 @@
                 <w:color w:val="595959"/>
                 <w:sz w:val="18"/>
               </w:rPr>
-              <w:t>mi-alz-&lt;region&gt;</w:t>
-            </w:r>
-          </w:p>
-        </w:tc>
-        <w:tc>
-          <w:tcPr>
-            <w:tcW w:type="dxa" w:w="3600"/>
-            <w:shd w:val="clear" w:color="auto" w:fill="FFFFFF"/>
-          </w:tcPr>
-          <w:p>
-            <w:r>
-              <w:rPr>
-                <w:color w:val="595959"/>
-                <w:sz w:val="18"/>
-              </w:rPr>
-              <w:t>avm/res/managed-identity/user-assigned-identity</w:t>
-            </w:r>
-          </w:p>
-        </w:tc>
-        <w:tc>
-          <w:tcPr>
-            <w:tcW w:type="dxa" w:w="1584"/>
-            <w:shd w:val="clear" w:color="auto" w:fill="FFFFFF"/>
-          </w:tcPr>
-          <w:p>
-            <w:r>
-              <w:rPr>
-                <w:color w:val="595959"/>
-                <w:sz w:val="18"/>
-              </w:rPr>
-              <w:t>GWC + NE</w:t>
+              <w:t>DCR – Change Tracking</w:t>
+            </w:r>
+          </w:p>
+        </w:tc>
+        <w:tc>
+          <w:tcPr>
+            <w:tcW w:type="dxa" w:w="3744"/>
+            <w:shd w:val="clear" w:color="auto" w:fill="FFFFFF"/>
+          </w:tcPr>
+          <w:p>
+            <w:r>
+              <w:rPr>
+                <w:color w:val="595959"/>
+                <w:sz w:val="18"/>
+              </w:rPr>
+              <w:t>dcr-ct-alz-germanywestcentral</w:t>
+            </w:r>
+          </w:p>
+        </w:tc>
+        <w:tc>
+          <w:tcPr>
+            <w:tcW w:type="dxa" w:w="3312"/>
+            <w:shd w:val="clear" w:color="auto" w:fill="FFFFFF"/>
+          </w:tcPr>
+          <w:p>
+            <w:r>
+              <w:rPr>
+                <w:color w:val="595959"/>
+                <w:sz w:val="18"/>
+              </w:rPr>
+              <w:t>avm/ptn/alz/ama:0.2.0</w:t>
+            </w:r>
+          </w:p>
+        </w:tc>
+        <w:tc>
+          <w:tcPr>
+            <w:tcW w:type="dxa" w:w="1296"/>
+            <w:shd w:val="clear" w:color="auto" w:fill="FFFFFF"/>
+          </w:tcPr>
+          <w:p>
+            <w:r>
+              <w:rPr>
+                <w:color w:val="595959"/>
+                <w:sz w:val="18"/>
+              </w:rPr>
+              <w:t>GWC</w:t>
             </w:r>
           </w:p>
         </w:tc>
@@ -17525,52 +17659,114 @@
                 <w:color w:val="595959"/>
                 <w:sz w:val="18"/>
               </w:rPr>
-              <w:t>DCR – VM Insights</w:t>
-            </w:r>
-          </w:p>
-        </w:tc>
+              <w:t>DCR – Defender SQL</w:t>
+            </w:r>
+          </w:p>
+        </w:tc>
+        <w:tc>
+          <w:tcPr>
+            <w:tcW w:type="dxa" w:w="3744"/>
+            <w:shd w:val="clear" w:color="auto" w:fill="F2F9F5"/>
+          </w:tcPr>
+          <w:p>
+            <w:r>
+              <w:rPr>
+                <w:color w:val="595959"/>
+                <w:sz w:val="18"/>
+              </w:rPr>
+              <w:t>dcr-mdfcsql-alz-germanywestcentral</w:t>
+            </w:r>
+          </w:p>
+        </w:tc>
+        <w:tc>
+          <w:tcPr>
+            <w:tcW w:type="dxa" w:w="3312"/>
+            <w:shd w:val="clear" w:color="auto" w:fill="F2F9F5"/>
+          </w:tcPr>
+          <w:p>
+            <w:r>
+              <w:rPr>
+                <w:color w:val="595959"/>
+                <w:sz w:val="18"/>
+              </w:rPr>
+              <w:t>avm/ptn/alz/ama:0.2.0</w:t>
+            </w:r>
+          </w:p>
+        </w:tc>
+        <w:tc>
+          <w:tcPr>
+            <w:tcW w:type="dxa" w:w="1296"/>
+            <w:shd w:val="clear" w:color="auto" w:fill="F2F9F5"/>
+          </w:tcPr>
+          <w:p>
+            <w:r>
+              <w:rPr>
+                <w:color w:val="595959"/>
+                <w:sz w:val="18"/>
+              </w:rPr>
+              <w:t>GWC</w:t>
+            </w:r>
+          </w:p>
+        </w:tc>
+      </w:tr>
+      <w:tr>
         <w:tc>
           <w:tcPr>
             <w:tcW w:type="dxa" w:w="3168"/>
-            <w:shd w:val="clear" w:color="auto" w:fill="F2F9F5"/>
-          </w:tcPr>
-          <w:p>
-            <w:r>
-              <w:rPr>
-                <w:color w:val="595959"/>
-                <w:sz w:val="18"/>
-              </w:rPr>
-              <w:t>dcr-vminsights-alz-&lt;r&gt;</w:t>
-            </w:r>
-          </w:p>
-        </w:tc>
-        <w:tc>
-          <w:tcPr>
-            <w:tcW w:type="dxa" w:w="3600"/>
-            <w:shd w:val="clear" w:color="auto" w:fill="F2F9F5"/>
-          </w:tcPr>
-          <w:p>
-            <w:r>
-              <w:rPr>
-                <w:color w:val="595959"/>
-                <w:sz w:val="18"/>
-              </w:rPr>
-              <w:t>avm/ptn/alz/ama:0.2.0</w:t>
-            </w:r>
-          </w:p>
-        </w:tc>
-        <w:tc>
-          <w:tcPr>
-            <w:tcW w:type="dxa" w:w="1584"/>
-            <w:shd w:val="clear" w:color="auto" w:fill="F2F9F5"/>
-          </w:tcPr>
-          <w:p>
-            <w:r>
-              <w:rPr>
-                <w:color w:val="595959"/>
-                <w:sz w:val="18"/>
-              </w:rPr>
-              <w:t>GWC + NE</w:t>
+            <w:shd w:val="clear" w:color="auto" w:fill="FFFFFF"/>
+          </w:tcPr>
+          <w:p>
+            <w:r>
+              <w:rPr>
+                <w:color w:val="595959"/>
+                <w:sz w:val="18"/>
+              </w:rPr>
+              <w:t>Data Collection Endpoint</w:t>
+            </w:r>
+          </w:p>
+        </w:tc>
+        <w:tc>
+          <w:tcPr>
+            <w:tcW w:type="dxa" w:w="3744"/>
+            <w:shd w:val="clear" w:color="auto" w:fill="FFFFFF"/>
+          </w:tcPr>
+          <w:p>
+            <w:r>
+              <w:rPr>
+                <w:color w:val="595959"/>
+                <w:sz w:val="18"/>
+              </w:rPr>
+              <w:t>dce-alz-germanywestcentral</w:t>
+            </w:r>
+          </w:p>
+        </w:tc>
+        <w:tc>
+          <w:tcPr>
+            <w:tcW w:type="dxa" w:w="3312"/>
+            <w:shd w:val="clear" w:color="auto" w:fill="FFFFFF"/>
+          </w:tcPr>
+          <w:p>
+            <w:r>
+              <w:rPr>
+                <w:color w:val="595959"/>
+                <w:sz w:val="18"/>
+              </w:rPr>
+              <w:t>avm/res/insights/data-collection-endpoint</w:t>
+            </w:r>
+          </w:p>
+        </w:tc>
+        <w:tc>
+          <w:tcPr>
+            <w:tcW w:type="dxa" w:w="1296"/>
+            <w:shd w:val="clear" w:color="auto" w:fill="FFFFFF"/>
+          </w:tcPr>
+          <w:p>
+            <w:r>
+              <w:rPr>
+                <w:color w:val="595959"/>
+                <w:sz w:val="18"/>
+              </w:rPr>
+              <w:t>GWC</w:t>
             </w:r>
           </w:p>
         </w:tc>
@@ -17579,192 +17775,6 @@
         <w:tc>
           <w:tcPr>
             <w:tcW w:type="dxa" w:w="3168"/>
-            <w:shd w:val="clear" w:color="auto" w:fill="FFFFFF"/>
-          </w:tcPr>
-          <w:p>
-            <w:r>
-              <w:rPr>
-                <w:color w:val="595959"/>
-                <w:sz w:val="18"/>
-              </w:rPr>
-              <w:t>DCR – Change Tracking</w:t>
-            </w:r>
-          </w:p>
-        </w:tc>
-        <w:tc>
-          <w:tcPr>
-            <w:tcW w:type="dxa" w:w="3168"/>
-            <w:shd w:val="clear" w:color="auto" w:fill="FFFFFF"/>
-          </w:tcPr>
-          <w:p>
-            <w:r>
-              <w:rPr>
-                <w:color w:val="595959"/>
-                <w:sz w:val="18"/>
-              </w:rPr>
-              <w:t>dcr-changetracking-alz-&lt;r&gt;</w:t>
-            </w:r>
-          </w:p>
-        </w:tc>
-        <w:tc>
-          <w:tcPr>
-            <w:tcW w:type="dxa" w:w="3600"/>
-            <w:shd w:val="clear" w:color="auto" w:fill="FFFFFF"/>
-          </w:tcPr>
-          <w:p>
-            <w:r>
-              <w:rPr>
-                <w:color w:val="595959"/>
-                <w:sz w:val="18"/>
-              </w:rPr>
-              <w:t>avm/ptn/alz/ama:0.2.0</w:t>
-            </w:r>
-          </w:p>
-        </w:tc>
-        <w:tc>
-          <w:tcPr>
-            <w:tcW w:type="dxa" w:w="1584"/>
-            <w:shd w:val="clear" w:color="auto" w:fill="FFFFFF"/>
-          </w:tcPr>
-          <w:p>
-            <w:r>
-              <w:rPr>
-                <w:color w:val="595959"/>
-                <w:sz w:val="18"/>
-              </w:rPr>
-              <w:t>GWC + NE</w:t>
-            </w:r>
-          </w:p>
-        </w:tc>
-      </w:tr>
-      <w:tr>
-        <w:tc>
-          <w:tcPr>
-            <w:tcW w:type="dxa" w:w="3168"/>
-            <w:shd w:val="clear" w:color="auto" w:fill="F2F9F5"/>
-          </w:tcPr>
-          <w:p>
-            <w:r>
-              <w:rPr>
-                <w:color w:val="595959"/>
-                <w:sz w:val="18"/>
-              </w:rPr>
-              <w:t>DCR – Defender SQL</w:t>
-            </w:r>
-          </w:p>
-        </w:tc>
-        <w:tc>
-          <w:tcPr>
-            <w:tcW w:type="dxa" w:w="3168"/>
-            <w:shd w:val="clear" w:color="auto" w:fill="F2F9F5"/>
-          </w:tcPr>
-          <w:p>
-            <w:r>
-              <w:rPr>
-                <w:color w:val="595959"/>
-                <w:sz w:val="18"/>
-              </w:rPr>
-              <w:t>dcr-mdfcsql-alz-&lt;r&gt;</w:t>
-            </w:r>
-          </w:p>
-        </w:tc>
-        <w:tc>
-          <w:tcPr>
-            <w:tcW w:type="dxa" w:w="3600"/>
-            <w:shd w:val="clear" w:color="auto" w:fill="F2F9F5"/>
-          </w:tcPr>
-          <w:p>
-            <w:r>
-              <w:rPr>
-                <w:color w:val="595959"/>
-                <w:sz w:val="18"/>
-              </w:rPr>
-              <w:t>avm/ptn/alz/ama:0.2.0</w:t>
-            </w:r>
-          </w:p>
-        </w:tc>
-        <w:tc>
-          <w:tcPr>
-            <w:tcW w:type="dxa" w:w="1584"/>
-            <w:shd w:val="clear" w:color="auto" w:fill="F2F9F5"/>
-          </w:tcPr>
-          <w:p>
-            <w:r>
-              <w:rPr>
-                <w:color w:val="595959"/>
-                <w:sz w:val="18"/>
-              </w:rPr>
-              <w:t>GWC + NE</w:t>
-            </w:r>
-          </w:p>
-        </w:tc>
-      </w:tr>
-      <w:tr>
-        <w:tc>
-          <w:tcPr>
-            <w:tcW w:type="dxa" w:w="3168"/>
-            <w:shd w:val="clear" w:color="auto" w:fill="FFFFFF"/>
-          </w:tcPr>
-          <w:p>
-            <w:r>
-              <w:rPr>
-                <w:color w:val="595959"/>
-                <w:sz w:val="18"/>
-              </w:rPr>
-              <w:t>Data Collection Endpoint</w:t>
-            </w:r>
-          </w:p>
-        </w:tc>
-        <w:tc>
-          <w:tcPr>
-            <w:tcW w:type="dxa" w:w="3168"/>
-            <w:shd w:val="clear" w:color="auto" w:fill="FFFFFF"/>
-          </w:tcPr>
-          <w:p>
-            <w:r>
-              <w:rPr>
-                <w:color w:val="595959"/>
-                <w:sz w:val="18"/>
-              </w:rPr>
-              <w:t>dce-alz-&lt;region&gt;</w:t>
-            </w:r>
-          </w:p>
-        </w:tc>
-        <w:tc>
-          <w:tcPr>
-            <w:tcW w:type="dxa" w:w="3600"/>
-            <w:shd w:val="clear" w:color="auto" w:fill="FFFFFF"/>
-          </w:tcPr>
-          <w:p>
-            <w:r>
-              <w:rPr>
-                <w:color w:val="595959"/>
-                <w:sz w:val="18"/>
-              </w:rPr>
-              <w:t>avm/res/insights/data-collection-endpoint</w:t>
-            </w:r>
-          </w:p>
-        </w:tc>
-        <w:tc>
-          <w:tcPr>
-            <w:tcW w:type="dxa" w:w="1584"/>
-            <w:shd w:val="clear" w:color="auto" w:fill="FFFFFF"/>
-          </w:tcPr>
-          <w:p>
-            <w:r>
-              <w:rPr>
-                <w:color w:val="595959"/>
-                <w:sz w:val="18"/>
-              </w:rPr>
-              <w:t>GWC + NE</w:t>
-            </w:r>
-          </w:p>
-        </w:tc>
-      </w:tr>
-      <w:tr>
-        <w:tc>
-          <w:tcPr>
-            <w:tcW w:type="dxa" w:w="3168"/>
             <w:shd w:val="clear" w:color="auto" w:fill="F2F9F5"/>
           </w:tcPr>
           <w:p>
@@ -17779,22 +17789,22 @@
         </w:tc>
         <w:tc>
           <w:tcPr>
-            <w:tcW w:type="dxa" w:w="3168"/>
-            <w:shd w:val="clear" w:color="auto" w:fill="F2F9F5"/>
-          </w:tcPr>
-          <w:p>
-            <w:r>
-              <w:rPr>
-                <w:color w:val="595959"/>
-                <w:sz w:val="18"/>
-              </w:rPr>
-              <w:t>aa-alz-&lt;region&gt;</w:t>
-            </w:r>
-          </w:p>
-        </w:tc>
-        <w:tc>
-          <w:tcPr>
-            <w:tcW w:type="dxa" w:w="3600"/>
+            <w:tcW w:type="dxa" w:w="3744"/>
+            <w:shd w:val="clear" w:color="auto" w:fill="F2F9F5"/>
+          </w:tcPr>
+          <w:p>
+            <w:r>
+              <w:rPr>
+                <w:color w:val="595959"/>
+                <w:sz w:val="18"/>
+              </w:rPr>
+              <w:t>aa-alz-germanywestcentral</w:t>
+            </w:r>
+          </w:p>
+        </w:tc>
+        <w:tc>
+          <w:tcPr>
+            <w:tcW w:type="dxa" w:w="3312"/>
             <w:shd w:val="clear" w:color="auto" w:fill="F2F9F5"/>
           </w:tcPr>
           <w:p>
@@ -17809,16 +17819,16 @@
         </w:tc>
         <w:tc>
           <w:tcPr>
-            <w:tcW w:type="dxa" w:w="1584"/>
-            <w:shd w:val="clear" w:color="auto" w:fill="F2F9F5"/>
-          </w:tcPr>
-          <w:p>
-            <w:r>
-              <w:rPr>
-                <w:color w:val="595959"/>
-                <w:sz w:val="18"/>
-              </w:rPr>
-              <w:t>GWC + NE</w:t>
+            <w:tcW w:type="dxa" w:w="1296"/>
+            <w:shd w:val="clear" w:color="auto" w:fill="F2F9F5"/>
+          </w:tcPr>
+          <w:p>
+            <w:r>
+              <w:rPr>
+                <w:color w:val="595959"/>
+                <w:sz w:val="18"/>
+              </w:rPr>
+              <w:t>GWC (optional)</w:t>
             </w:r>
           </w:p>
         </w:tc>
@@ -17830,7 +17840,17 @@
         <w:pStyle w:val="Heading2"/>
       </w:pPr>
       <w:r>
-        <w:t>6.3 Netzwerk-Module (Hub per Region)</w:t>
+        <w:t>6.3 Netzwerk-Module (Hub – Primärregion GWC)</w:t>
+      </w:r>
+    </w:p>
+    <w:p>
+      <w:pPr/>
+      <w:r>
+        <w:rPr>
+          <w:color w:val="595959"/>
+          <w:sz w:val="20"/>
+        </w:rPr>
+        <w:t>Bechtle-Empfehlung (Variante A/B, ~€1.050/Monat): 1 Hub in Germany West Central, Firewall Standard. Kein zweiter Hub – Geo-Redundanz nur bei Variante D (Microsoft Default, ~€5.800/Monat).</w:t>
       </w:r>
     </w:p>
     <w:tbl>
@@ -17865,6 +17885,22 @@
         </w:tc>
         <w:tc>
           <w:tcPr>
+            <w:tcW w:type="dxa" w:w="3312"/>
+            <w:shd w:val="clear" w:color="auto" w:fill="053B25"/>
+          </w:tcPr>
+          <w:p>
+            <w:r>
+              <w:rPr>
+                <w:b/>
+                <w:color w:val="FFFFFF"/>
+                <w:sz w:val="18"/>
+              </w:rPr>
+              <w:t>Name-Konvention</w:t>
+            </w:r>
+          </w:p>
+        </w:tc>
+        <w:tc>
+          <w:tcPr>
             <w:tcW w:type="dxa" w:w="2880"/>
             <w:shd w:val="clear" w:color="auto" w:fill="053B25"/>
           </w:tcPr>
@@ -17875,13 +17911,13 @@
                 <w:color w:val="FFFFFF"/>
                 <w:sz w:val="18"/>
               </w:rPr>
-              <w:t>Name-Konvention</w:t>
-            </w:r>
-          </w:p>
-        </w:tc>
-        <w:tc>
-          <w:tcPr>
-            <w:tcW w:type="dxa" w:w="3168"/>
+              <w:t>AVM-Modul</w:t>
+            </w:r>
+          </w:p>
+        </w:tc>
+        <w:tc>
+          <w:tcPr>
+            <w:tcW w:type="dxa" w:w="1584"/>
             <w:shd w:val="clear" w:color="auto" w:fill="053B25"/>
           </w:tcPr>
           <w:p>
@@ -17891,13 +17927,13 @@
                 <w:color w:val="FFFFFF"/>
                 <w:sz w:val="18"/>
               </w:rPr>
-              <w:t>AVM-Modul</w:t>
-            </w:r>
-          </w:p>
-        </w:tc>
-        <w:tc>
-          <w:tcPr>
-            <w:tcW w:type="dxa" w:w="1872"/>
+              <w:t>Hub GWC</w:t>
+            </w:r>
+          </w:p>
+        </w:tc>
+        <w:tc>
+          <w:tcPr>
+            <w:tcW w:type="dxa" w:w="1440"/>
             <w:shd w:val="clear" w:color="auto" w:fill="053B25"/>
           </w:tcPr>
           <w:p>
@@ -17907,23 +17943,7 @@
                 <w:color w:val="FFFFFF"/>
                 <w:sz w:val="18"/>
               </w:rPr>
-              <w:t>Hub 1 (GWC)</w:t>
-            </w:r>
-          </w:p>
-        </w:tc>
-        <w:tc>
-          <w:tcPr>
-            <w:tcW w:type="dxa" w:w="1008"/>
-            <w:shd w:val="clear" w:color="auto" w:fill="053B25"/>
-          </w:tcPr>
-          <w:p>
-            <w:r>
-              <w:rPr>
-                <w:b/>
-                <w:color w:val="FFFFFF"/>
-                <w:sz w:val="18"/>
-              </w:rPr>
-              <w:t>Hub 2 (NE)</w:t>
+              <w:t>Status</w:t>
             </w:r>
           </w:p>
         </w:tc>
@@ -17946,6 +17966,21 @@
         </w:tc>
         <w:tc>
           <w:tcPr>
+            <w:tcW w:type="dxa" w:w="3312"/>
+            <w:shd w:val="clear" w:color="auto" w:fill="F2F9F5"/>
+          </w:tcPr>
+          <w:p>
+            <w:r>
+              <w:rPr>
+                <w:color w:val="595959"/>
+                <w:sz w:val="18"/>
+              </w:rPr>
+              <w:t>vnet-alz-germanywestcentral</w:t>
+            </w:r>
+          </w:p>
+        </w:tc>
+        <w:tc>
+          <w:tcPr>
             <w:tcW w:type="dxa" w:w="2880"/>
             <w:shd w:val="clear" w:color="auto" w:fill="F2F9F5"/>
           </w:tcPr>
@@ -17955,52 +17990,37 @@
                 <w:color w:val="595959"/>
                 <w:sz w:val="18"/>
               </w:rPr>
-              <w:t>vnet-alz-hub-&lt;r&gt;</w:t>
-            </w:r>
-          </w:p>
-        </w:tc>
-        <w:tc>
-          <w:tcPr>
-            <w:tcW w:type="dxa" w:w="3168"/>
-            <w:shd w:val="clear" w:color="auto" w:fill="F2F9F5"/>
-          </w:tcPr>
-          <w:p>
-            <w:r>
-              <w:rPr>
-                <w:color w:val="595959"/>
-                <w:sz w:val="18"/>
-              </w:rPr>
               <w:t>avm/res/network/virtual-network</w:t>
             </w:r>
           </w:p>
         </w:tc>
         <w:tc>
           <w:tcPr>
-            <w:tcW w:type="dxa" w:w="1872"/>
-            <w:shd w:val="clear" w:color="auto" w:fill="F2F9F5"/>
-          </w:tcPr>
-          <w:p>
-            <w:r>
-              <w:rPr>
-                <w:color w:val="595959"/>
-                <w:sz w:val="18"/>
-              </w:rPr>
-              <w:t>10.0.0.0/24</w:t>
-            </w:r>
-          </w:p>
-        </w:tc>
-        <w:tc>
-          <w:tcPr>
-            <w:tcW w:type="dxa" w:w="1008"/>
-            <w:shd w:val="clear" w:color="auto" w:fill="F2F9F5"/>
-          </w:tcPr>
-          <w:p>
-            <w:r>
-              <w:rPr>
-                <w:color w:val="595959"/>
-                <w:sz w:val="18"/>
-              </w:rPr>
-              <w:t>10.1.0.0/24</w:t>
+            <w:tcW w:type="dxa" w:w="1584"/>
+            <w:shd w:val="clear" w:color="auto" w:fill="F2F9F5"/>
+          </w:tcPr>
+          <w:p>
+            <w:r>
+              <w:rPr>
+                <w:color w:val="595959"/>
+                <w:sz w:val="18"/>
+              </w:rPr>
+              <w:t>10.0.0.0/22</w:t>
+            </w:r>
+          </w:p>
+        </w:tc>
+        <w:tc>
+          <w:tcPr>
+            <w:tcW w:type="dxa" w:w="1440"/>
+            <w:shd w:val="clear" w:color="auto" w:fill="F2F9F5"/>
+          </w:tcPr>
+          <w:p>
+            <w:r>
+              <w:rPr>
+                <w:color w:val="595959"/>
+                <w:sz w:val="18"/>
+              </w:rPr>
+              <w:t>Aktiv</w:t>
             </w:r>
           </w:p>
         </w:tc>
@@ -18017,7 +18037,22 @@
                 <w:color w:val="595959"/>
                 <w:sz w:val="18"/>
               </w:rPr>
-              <w:t>Azure Firewall Premium</w:t>
+              <w:t>Azure Firewall Standard</w:t>
+            </w:r>
+          </w:p>
+        </w:tc>
+        <w:tc>
+          <w:tcPr>
+            <w:tcW w:type="dxa" w:w="3312"/>
+            <w:shd w:val="clear" w:color="auto" w:fill="FFFFFF"/>
+          </w:tcPr>
+          <w:p>
+            <w:r>
+              <w:rPr>
+                <w:color w:val="595959"/>
+                <w:sz w:val="18"/>
+              </w:rPr>
+              <w:t>afw-alz-germanywestcentral</w:t>
             </w:r>
           </w:p>
         </w:tc>
@@ -18032,52 +18067,37 @@
                 <w:color w:val="595959"/>
                 <w:sz w:val="18"/>
               </w:rPr>
-              <w:t>afw-alz-&lt;r&gt;</w:t>
-            </w:r>
-          </w:p>
-        </w:tc>
-        <w:tc>
-          <w:tcPr>
-            <w:tcW w:type="dxa" w:w="3168"/>
-            <w:shd w:val="clear" w:color="auto" w:fill="FFFFFF"/>
-          </w:tcPr>
-          <w:p>
-            <w:r>
-              <w:rPr>
-                <w:color w:val="595959"/>
-                <w:sz w:val="18"/>
-              </w:rPr>
               <w:t>avm/res/network/azure-firewall</w:t>
             </w:r>
           </w:p>
         </w:tc>
         <w:tc>
           <w:tcPr>
-            <w:tcW w:type="dxa" w:w="1872"/>
-            <w:shd w:val="clear" w:color="auto" w:fill="FFFFFF"/>
-          </w:tcPr>
-          <w:p>
-            <w:r>
-              <w:rPr>
-                <w:color w:val="595959"/>
-                <w:sz w:val="18"/>
-              </w:rPr>
-              <w:t>10.0.0.4</w:t>
-            </w:r>
-          </w:p>
-        </w:tc>
-        <w:tc>
-          <w:tcPr>
-            <w:tcW w:type="dxa" w:w="1008"/>
-            <w:shd w:val="clear" w:color="auto" w:fill="FFFFFF"/>
-          </w:tcPr>
-          <w:p>
-            <w:r>
-              <w:rPr>
-                <w:color w:val="595959"/>
-                <w:sz w:val="18"/>
-              </w:rPr>
-              <w:t>10.1.0.4</w:t>
+            <w:tcW w:type="dxa" w:w="1584"/>
+            <w:shd w:val="clear" w:color="auto" w:fill="FFFFFF"/>
+          </w:tcPr>
+          <w:p>
+            <w:r>
+              <w:rPr>
+                <w:color w:val="595959"/>
+                <w:sz w:val="18"/>
+              </w:rPr>
+              <w:t>10.0.0.0/26</w:t>
+            </w:r>
+          </w:p>
+        </w:tc>
+        <w:tc>
+          <w:tcPr>
+            <w:tcW w:type="dxa" w:w="1440"/>
+            <w:shd w:val="clear" w:color="auto" w:fill="FFFFFF"/>
+          </w:tcPr>
+          <w:p>
+            <w:r>
+              <w:rPr>
+                <w:color w:val="595959"/>
+                <w:sz w:val="18"/>
+              </w:rPr>
+              <w:t>Aktiv</w:t>
             </w:r>
           </w:p>
         </w:tc>
@@ -18100,6 +18120,21 @@
         </w:tc>
         <w:tc>
           <w:tcPr>
+            <w:tcW w:type="dxa" w:w="3312"/>
+            <w:shd w:val="clear" w:color="auto" w:fill="F2F9F5"/>
+          </w:tcPr>
+          <w:p>
+            <w:r>
+              <w:rPr>
+                <w:color w:val="595959"/>
+                <w:sz w:val="18"/>
+              </w:rPr>
+              <w:t>afwp-alz-germanywestcentral</w:t>
+            </w:r>
+          </w:p>
+        </w:tc>
+        <w:tc>
+          <w:tcPr>
             <w:tcW w:type="dxa" w:w="2880"/>
             <w:shd w:val="clear" w:color="auto" w:fill="F2F9F5"/>
           </w:tcPr>
@@ -18109,52 +18144,37 @@
                 <w:color w:val="595959"/>
                 <w:sz w:val="18"/>
               </w:rPr>
-              <w:t>afwp-alz-&lt;r&gt;</w:t>
-            </w:r>
-          </w:p>
-        </w:tc>
-        <w:tc>
-          <w:tcPr>
-            <w:tcW w:type="dxa" w:w="3168"/>
-            <w:shd w:val="clear" w:color="auto" w:fill="F2F9F5"/>
-          </w:tcPr>
-          <w:p>
-            <w:r>
-              <w:rPr>
-                <w:color w:val="595959"/>
-                <w:sz w:val="18"/>
-              </w:rPr>
               <w:t>avm/res/network/firewall-policy</w:t>
             </w:r>
           </w:p>
         </w:tc>
         <w:tc>
           <w:tcPr>
-            <w:tcW w:type="dxa" w:w="1872"/>
-            <w:shd w:val="clear" w:color="auto" w:fill="F2F9F5"/>
-          </w:tcPr>
-          <w:p>
-            <w:r>
-              <w:rPr>
-                <w:color w:val="595959"/>
-                <w:sz w:val="18"/>
-              </w:rPr>
-              <w:t>Standard→Premium</w:t>
-            </w:r>
-          </w:p>
-        </w:tc>
-        <w:tc>
-          <w:tcPr>
-            <w:tcW w:type="dxa" w:w="1008"/>
-            <w:shd w:val="clear" w:color="auto" w:fill="F2F9F5"/>
-          </w:tcPr>
-          <w:p>
-            <w:r>
-              <w:rPr>
-                <w:color w:val="595959"/>
-                <w:sz w:val="18"/>
-              </w:rPr>
-              <w:t>Standard→Premium</w:t>
+            <w:tcW w:type="dxa" w:w="1584"/>
+            <w:shd w:val="clear" w:color="auto" w:fill="F2F9F5"/>
+          </w:tcPr>
+          <w:p>
+            <w:r>
+              <w:rPr>
+                <w:color w:val="595959"/>
+                <w:sz w:val="18"/>
+              </w:rPr>
+              <w:t>Standard</w:t>
+            </w:r>
+          </w:p>
+        </w:tc>
+        <w:tc>
+          <w:tcPr>
+            <w:tcW w:type="dxa" w:w="1440"/>
+            <w:shd w:val="clear" w:color="auto" w:fill="F2F9F5"/>
+          </w:tcPr>
+          <w:p>
+            <w:r>
+              <w:rPr>
+                <w:color w:val="595959"/>
+                <w:sz w:val="18"/>
+              </w:rPr>
+              <w:t>Aktiv</w:t>
             </w:r>
           </w:p>
         </w:tc>
@@ -18177,6 +18197,21 @@
         </w:tc>
         <w:tc>
           <w:tcPr>
+            <w:tcW w:type="dxa" w:w="3312"/>
+            <w:shd w:val="clear" w:color="auto" w:fill="FFFFFF"/>
+          </w:tcPr>
+          <w:p>
+            <w:r>
+              <w:rPr>
+                <w:color w:val="595959"/>
+                <w:sz w:val="18"/>
+              </w:rPr>
+              <w:t>bas-alz-germanywestcentral</w:t>
+            </w:r>
+          </w:p>
+        </w:tc>
+        <w:tc>
+          <w:tcPr>
             <w:tcW w:type="dxa" w:w="2880"/>
             <w:shd w:val="clear" w:color="auto" w:fill="FFFFFF"/>
           </w:tcPr>
@@ -18186,28 +18221,13 @@
                 <w:color w:val="595959"/>
                 <w:sz w:val="18"/>
               </w:rPr>
-              <w:t>bas-alz-&lt;r&gt;</w:t>
-            </w:r>
-          </w:p>
-        </w:tc>
-        <w:tc>
-          <w:tcPr>
-            <w:tcW w:type="dxa" w:w="3168"/>
-            <w:shd w:val="clear" w:color="auto" w:fill="FFFFFF"/>
-          </w:tcPr>
-          <w:p>
-            <w:r>
-              <w:rPr>
-                <w:color w:val="595959"/>
-                <w:sz w:val="18"/>
-              </w:rPr>
               <w:t>avm/res/network/bastion-host</w:t>
             </w:r>
           </w:p>
         </w:tc>
         <w:tc>
           <w:tcPr>
-            <w:tcW w:type="dxa" w:w="1872"/>
+            <w:tcW w:type="dxa" w:w="1584"/>
             <w:shd w:val="clear" w:color="auto" w:fill="FFFFFF"/>
           </w:tcPr>
           <w:p>
@@ -18222,16 +18242,16 @@
         </w:tc>
         <w:tc>
           <w:tcPr>
-            <w:tcW w:type="dxa" w:w="1008"/>
-            <w:shd w:val="clear" w:color="auto" w:fill="FFFFFF"/>
-          </w:tcPr>
-          <w:p>
-            <w:r>
-              <w:rPr>
-                <w:color w:val="595959"/>
-                <w:sz w:val="18"/>
-              </w:rPr>
-              <w:t>10.1.0.64/26</w:t>
+            <w:tcW w:type="dxa" w:w="1440"/>
+            <w:shd w:val="clear" w:color="auto" w:fill="FFFFFF"/>
+          </w:tcPr>
+          <w:p>
+            <w:r>
+              <w:rPr>
+                <w:color w:val="595959"/>
+                <w:sz w:val="18"/>
+              </w:rPr>
+              <w:t>Aktiv</w:t>
             </w:r>
           </w:p>
         </w:tc>
@@ -18254,6 +18274,21 @@
         </w:tc>
         <w:tc>
           <w:tcPr>
+            <w:tcW w:type="dxa" w:w="3312"/>
+            <w:shd w:val="clear" w:color="auto" w:fill="F2F9F5"/>
+          </w:tcPr>
+          <w:p>
+            <w:r>
+              <w:rPr>
+                <w:color w:val="595959"/>
+                <w:sz w:val="18"/>
+              </w:rPr>
+              <w:t>vgw-alz-germanywestcentral</w:t>
+            </w:r>
+          </w:p>
+        </w:tc>
+        <w:tc>
+          <w:tcPr>
             <w:tcW w:type="dxa" w:w="2880"/>
             <w:shd w:val="clear" w:color="auto" w:fill="F2F9F5"/>
           </w:tcPr>
@@ -18263,28 +18298,13 @@
                 <w:color w:val="595959"/>
                 <w:sz w:val="18"/>
               </w:rPr>
-              <w:t>vpngw-alz-&lt;r&gt;</w:t>
-            </w:r>
-          </w:p>
-        </w:tc>
-        <w:tc>
-          <w:tcPr>
-            <w:tcW w:type="dxa" w:w="3168"/>
-            <w:shd w:val="clear" w:color="auto" w:fill="F2F9F5"/>
-          </w:tcPr>
-          <w:p>
-            <w:r>
-              <w:rPr>
-                <w:color w:val="595959"/>
-                <w:sz w:val="18"/>
-              </w:rPr>
-              <w:t>avm/res/network/vpn-gateway</w:t>
-            </w:r>
-          </w:p>
-        </w:tc>
-        <w:tc>
-          <w:tcPr>
-            <w:tcW w:type="dxa" w:w="1872"/>
+              <w:t>avm/res/network/virtual-network-gateway</w:t>
+            </w:r>
+          </w:p>
+        </w:tc>
+        <w:tc>
+          <w:tcPr>
+            <w:tcW w:type="dxa" w:w="1584"/>
             <w:shd w:val="clear" w:color="auto" w:fill="F2F9F5"/>
           </w:tcPr>
           <w:p>
@@ -18299,16 +18319,16 @@
         </w:tc>
         <w:tc>
           <w:tcPr>
-            <w:tcW w:type="dxa" w:w="1008"/>
-            <w:shd w:val="clear" w:color="auto" w:fill="F2F9F5"/>
-          </w:tcPr>
-          <w:p>
-            <w:r>
-              <w:rPr>
-                <w:color w:val="595959"/>
-                <w:sz w:val="18"/>
-              </w:rPr>
-              <w:t>10.1.0.128/27</w:t>
+            <w:tcW w:type="dxa" w:w="1440"/>
+            <w:shd w:val="clear" w:color="auto" w:fill="F2F9F5"/>
+          </w:tcPr>
+          <w:p>
+            <w:r>
+              <w:rPr>
+                <w:color w:val="595959"/>
+                <w:sz w:val="18"/>
+              </w:rPr>
+              <w:t>Aktiv</w:t>
             </w:r>
           </w:p>
         </w:tc>
@@ -18325,12 +18345,335 @@
                 <w:color w:val="595959"/>
                 <w:sz w:val="18"/>
               </w:rPr>
+              <w:t>DNS Private Resolver</w:t>
+            </w:r>
+          </w:p>
+        </w:tc>
+        <w:tc>
+          <w:tcPr>
+            <w:tcW w:type="dxa" w:w="3312"/>
+            <w:shd w:val="clear" w:color="auto" w:fill="FFFFFF"/>
+          </w:tcPr>
+          <w:p>
+            <w:r>
+              <w:rPr>
+                <w:color w:val="595959"/>
+                <w:sz w:val="18"/>
+              </w:rPr>
+              <w:t>dnspr-alz-germanywestcentral</w:t>
+            </w:r>
+          </w:p>
+        </w:tc>
+        <w:tc>
+          <w:tcPr>
+            <w:tcW w:type="dxa" w:w="2880"/>
+            <w:shd w:val="clear" w:color="auto" w:fill="FFFFFF"/>
+          </w:tcPr>
+          <w:p>
+            <w:r>
+              <w:rPr>
+                <w:color w:val="595959"/>
+                <w:sz w:val="18"/>
+              </w:rPr>
+              <w:t>avm/res/network/dns-resolver</w:t>
+            </w:r>
+          </w:p>
+        </w:tc>
+        <w:tc>
+          <w:tcPr>
+            <w:tcW w:type="dxa" w:w="1584"/>
+            <w:shd w:val="clear" w:color="auto" w:fill="FFFFFF"/>
+          </w:tcPr>
+          <w:p>
+            <w:r>
+              <w:rPr>
+                <w:color w:val="595959"/>
+                <w:sz w:val="18"/>
+              </w:rPr>
+              <w:t>10.0.0.160/28</w:t>
+            </w:r>
+          </w:p>
+        </w:tc>
+        <w:tc>
+          <w:tcPr>
+            <w:tcW w:type="dxa" w:w="1440"/>
+            <w:shd w:val="clear" w:color="auto" w:fill="FFFFFF"/>
+          </w:tcPr>
+          <w:p>
+            <w:r>
+              <w:rPr>
+                <w:color w:val="595959"/>
+                <w:sz w:val="18"/>
+              </w:rPr>
+              <w:t>Aktiv</w:t>
+            </w:r>
+          </w:p>
+        </w:tc>
+      </w:tr>
+      <w:tr>
+        <w:tc>
+          <w:tcPr>
+            <w:tcW w:type="dxa" w:w="2592"/>
+            <w:shd w:val="clear" w:color="auto" w:fill="F2F9F5"/>
+          </w:tcPr>
+          <w:p>
+            <w:r>
+              <w:rPr>
+                <w:color w:val="595959"/>
+                <w:sz w:val="18"/>
+              </w:rPr>
+              <w:t>Public IP (Firewall)</w:t>
+            </w:r>
+          </w:p>
+        </w:tc>
+        <w:tc>
+          <w:tcPr>
+            <w:tcW w:type="dxa" w:w="3312"/>
+            <w:shd w:val="clear" w:color="auto" w:fill="F2F9F5"/>
+          </w:tcPr>
+          <w:p>
+            <w:r>
+              <w:rPr>
+                <w:color w:val="595959"/>
+                <w:sz w:val="18"/>
+              </w:rPr>
+              <w:t>pip-afw-alz-germanywestcentral</w:t>
+            </w:r>
+          </w:p>
+        </w:tc>
+        <w:tc>
+          <w:tcPr>
+            <w:tcW w:type="dxa" w:w="2880"/>
+            <w:shd w:val="clear" w:color="auto" w:fill="F2F9F5"/>
+          </w:tcPr>
+          <w:p>
+            <w:r>
+              <w:rPr>
+                <w:color w:val="595959"/>
+                <w:sz w:val="18"/>
+              </w:rPr>
+              <w:t>avm/res/network/public-ip-address</w:t>
+            </w:r>
+          </w:p>
+        </w:tc>
+        <w:tc>
+          <w:tcPr>
+            <w:tcW w:type="dxa" w:w="1584"/>
+            <w:shd w:val="clear" w:color="auto" w:fill="F2F9F5"/>
+          </w:tcPr>
+          <w:p>
+            <w:r>
+              <w:rPr>
+                <w:color w:val="595959"/>
+                <w:sz w:val="18"/>
+              </w:rPr>
+              <w:t>Zone-redundant</w:t>
+            </w:r>
+          </w:p>
+        </w:tc>
+        <w:tc>
+          <w:tcPr>
+            <w:tcW w:type="dxa" w:w="1440"/>
+            <w:shd w:val="clear" w:color="auto" w:fill="F2F9F5"/>
+          </w:tcPr>
+          <w:p>
+            <w:r>
+              <w:rPr>
+                <w:color w:val="595959"/>
+                <w:sz w:val="18"/>
+              </w:rPr>
+              <w:t>Aktiv</w:t>
+            </w:r>
+          </w:p>
+        </w:tc>
+      </w:tr>
+      <w:tr>
+        <w:tc>
+          <w:tcPr>
+            <w:tcW w:type="dxa" w:w="2592"/>
+            <w:shd w:val="clear" w:color="auto" w:fill="FFFFFF"/>
+          </w:tcPr>
+          <w:p>
+            <w:r>
+              <w:rPr>
+                <w:color w:val="595959"/>
+                <w:sz w:val="18"/>
+              </w:rPr>
+              <w:t>Public IP (Bastion)</w:t>
+            </w:r>
+          </w:p>
+        </w:tc>
+        <w:tc>
+          <w:tcPr>
+            <w:tcW w:type="dxa" w:w="3312"/>
+            <w:shd w:val="clear" w:color="auto" w:fill="FFFFFF"/>
+          </w:tcPr>
+          <w:p>
+            <w:r>
+              <w:rPr>
+                <w:color w:val="595959"/>
+                <w:sz w:val="18"/>
+              </w:rPr>
+              <w:t>pip-bas-alz-germanywestcentral</w:t>
+            </w:r>
+          </w:p>
+        </w:tc>
+        <w:tc>
+          <w:tcPr>
+            <w:tcW w:type="dxa" w:w="2880"/>
+            <w:shd w:val="clear" w:color="auto" w:fill="FFFFFF"/>
+          </w:tcPr>
+          <w:p>
+            <w:r>
+              <w:rPr>
+                <w:color w:val="595959"/>
+                <w:sz w:val="18"/>
+              </w:rPr>
+              <w:t>avm/res/network/public-ip-address</w:t>
+            </w:r>
+          </w:p>
+        </w:tc>
+        <w:tc>
+          <w:tcPr>
+            <w:tcW w:type="dxa" w:w="1584"/>
+            <w:shd w:val="clear" w:color="auto" w:fill="FFFFFF"/>
+          </w:tcPr>
+          <w:p>
+            <w:r>
+              <w:rPr>
+                <w:color w:val="595959"/>
+                <w:sz w:val="18"/>
+              </w:rPr>
+              <w:t>Zone-redundant</w:t>
+            </w:r>
+          </w:p>
+        </w:tc>
+        <w:tc>
+          <w:tcPr>
+            <w:tcW w:type="dxa" w:w="1440"/>
+            <w:shd w:val="clear" w:color="auto" w:fill="FFFFFF"/>
+          </w:tcPr>
+          <w:p>
+            <w:r>
+              <w:rPr>
+                <w:color w:val="595959"/>
+                <w:sz w:val="18"/>
+              </w:rPr>
+              <w:t>Aktiv</w:t>
+            </w:r>
+          </w:p>
+        </w:tc>
+      </w:tr>
+      <w:tr>
+        <w:tc>
+          <w:tcPr>
+            <w:tcW w:type="dxa" w:w="2592"/>
+            <w:shd w:val="clear" w:color="auto" w:fill="F2F9F5"/>
+          </w:tcPr>
+          <w:p>
+            <w:r>
+              <w:rPr>
+                <w:color w:val="595959"/>
+                <w:sz w:val="18"/>
+              </w:rPr>
+              <w:t>Public IP (VPN GW)</w:t>
+            </w:r>
+          </w:p>
+        </w:tc>
+        <w:tc>
+          <w:tcPr>
+            <w:tcW w:type="dxa" w:w="3312"/>
+            <w:shd w:val="clear" w:color="auto" w:fill="F2F9F5"/>
+          </w:tcPr>
+          <w:p>
+            <w:r>
+              <w:rPr>
+                <w:color w:val="595959"/>
+                <w:sz w:val="18"/>
+              </w:rPr>
+              <w:t>pip-vpngw-alz-germanywestcentral</w:t>
+            </w:r>
+          </w:p>
+        </w:tc>
+        <w:tc>
+          <w:tcPr>
+            <w:tcW w:type="dxa" w:w="2880"/>
+            <w:shd w:val="clear" w:color="auto" w:fill="F2F9F5"/>
+          </w:tcPr>
+          <w:p>
+            <w:r>
+              <w:rPr>
+                <w:color w:val="595959"/>
+                <w:sz w:val="18"/>
+              </w:rPr>
+              <w:t>avm/res/network/public-ip-address</w:t>
+            </w:r>
+          </w:p>
+        </w:tc>
+        <w:tc>
+          <w:tcPr>
+            <w:tcW w:type="dxa" w:w="1584"/>
+            <w:shd w:val="clear" w:color="auto" w:fill="F2F9F5"/>
+          </w:tcPr>
+          <w:p>
+            <w:r>
+              <w:rPr>
+                <w:color w:val="595959"/>
+                <w:sz w:val="18"/>
+              </w:rPr>
+              <w:t>Zone-redundant</w:t>
+            </w:r>
+          </w:p>
+        </w:tc>
+        <w:tc>
+          <w:tcPr>
+            <w:tcW w:type="dxa" w:w="1440"/>
+            <w:shd w:val="clear" w:color="auto" w:fill="F2F9F5"/>
+          </w:tcPr>
+          <w:p>
+            <w:r>
+              <w:rPr>
+                <w:color w:val="595959"/>
+                <w:sz w:val="18"/>
+              </w:rPr>
+              <w:t>Aktiv</w:t>
+            </w:r>
+          </w:p>
+        </w:tc>
+      </w:tr>
+      <w:tr>
+        <w:tc>
+          <w:tcPr>
+            <w:tcW w:type="dxa" w:w="2592"/>
+            <w:shd w:val="clear" w:color="auto" w:fill="FFFFFF"/>
+          </w:tcPr>
+          <w:p>
+            <w:r>
+              <w:rPr>
+                <w:color w:val="595959"/>
+                <w:sz w:val="18"/>
+              </w:rPr>
               <w:t>ExpressRoute Gateway</w:t>
             </w:r>
           </w:p>
         </w:tc>
         <w:tc>
           <w:tcPr>
+            <w:tcW w:type="dxa" w:w="3312"/>
+            <w:shd w:val="clear" w:color="auto" w:fill="FFFFFF"/>
+          </w:tcPr>
+          <w:p>
+            <w:r>
+              <w:rPr>
+                <w:color w:val="595959"/>
+                <w:sz w:val="18"/>
+              </w:rPr>
+              <w:t>ergw-alz-germanywestcentral</w:t>
+            </w:r>
+          </w:p>
+        </w:tc>
+        <w:tc>
+          <w:tcPr>
             <w:tcW w:type="dxa" w:w="2880"/>
             <w:shd w:val="clear" w:color="auto" w:fill="FFFFFF"/>
           </w:tcPr>
@@ -18340,28 +18683,13 @@
                 <w:color w:val="595959"/>
                 <w:sz w:val="18"/>
               </w:rPr>
-              <w:t>ergw-alz-&lt;r&gt;</w:t>
-            </w:r>
-          </w:p>
-        </w:tc>
-        <w:tc>
-          <w:tcPr>
-            <w:tcW w:type="dxa" w:w="3168"/>
-            <w:shd w:val="clear" w:color="auto" w:fill="FFFFFF"/>
-          </w:tcPr>
-          <w:p>
-            <w:r>
-              <w:rPr>
-                <w:color w:val="595959"/>
-                <w:sz w:val="18"/>
-              </w:rPr>
               <w:t>avm/res/network/express-route-gateway</w:t>
             </w:r>
           </w:p>
         </w:tc>
         <w:tc>
           <w:tcPr>
-            <w:tcW w:type="dxa" w:w="1872"/>
+            <w:tcW w:type="dxa" w:w="1584"/>
             <w:shd w:val="clear" w:color="auto" w:fill="FFFFFF"/>
           </w:tcPr>
           <w:p>
@@ -18376,16 +18704,16 @@
         </w:tc>
         <w:tc>
           <w:tcPr>
-            <w:tcW w:type="dxa" w:w="1008"/>
-            <w:shd w:val="clear" w:color="auto" w:fill="FFFFFF"/>
-          </w:tcPr>
-          <w:p>
-            <w:r>
-              <w:rPr>
-                <w:color w:val="595959"/>
-                <w:sz w:val="18"/>
-              </w:rPr>
-              <w:t>10.1.0.128/27</w:t>
+            <w:tcW w:type="dxa" w:w="1440"/>
+            <w:shd w:val="clear" w:color="auto" w:fill="FFFFFF"/>
+          </w:tcPr>
+          <w:p>
+            <w:r>
+              <w:rPr>
+                <w:color w:val="595959"/>
+                <w:sz w:val="18"/>
+              </w:rPr>
+              <w:t>Zurückgestellt</w:t>
             </w:r>
           </w:p>
         </w:tc>
@@ -18402,7 +18730,22 @@
                 <w:color w:val="595959"/>
                 <w:sz w:val="18"/>
               </w:rPr>
-              <w:t>DNS Private Resolver</w:t>
+              <w:t>DDoS Protection Plan</w:t>
+            </w:r>
+          </w:p>
+        </w:tc>
+        <w:tc>
+          <w:tcPr>
+            <w:tcW w:type="dxa" w:w="3312"/>
+            <w:shd w:val="clear" w:color="auto" w:fill="F2F9F5"/>
+          </w:tcPr>
+          <w:p>
+            <w:r>
+              <w:rPr>
+                <w:color w:val="595959"/>
+                <w:sz w:val="18"/>
+              </w:rPr>
+              <w:t>ddos-alz</w:t>
             </w:r>
           </w:p>
         </w:tc>
@@ -18417,52 +18760,37 @@
                 <w:color w:val="595959"/>
                 <w:sz w:val="18"/>
               </w:rPr>
-              <w:t>dnspr-alz-&lt;r&gt;</w:t>
-            </w:r>
-          </w:p>
-        </w:tc>
-        <w:tc>
-          <w:tcPr>
-            <w:tcW w:type="dxa" w:w="3168"/>
-            <w:shd w:val="clear" w:color="auto" w:fill="F2F9F5"/>
-          </w:tcPr>
-          <w:p>
-            <w:r>
-              <w:rPr>
-                <w:color w:val="595959"/>
-                <w:sz w:val="18"/>
-              </w:rPr>
-              <w:t>avm/res/network/dns-resolver</w:t>
-            </w:r>
-          </w:p>
-        </w:tc>
-        <w:tc>
-          <w:tcPr>
-            <w:tcW w:type="dxa" w:w="1872"/>
-            <w:shd w:val="clear" w:color="auto" w:fill="F2F9F5"/>
-          </w:tcPr>
-          <w:p>
-            <w:r>
-              <w:rPr>
-                <w:color w:val="595959"/>
-                <w:sz w:val="18"/>
-              </w:rPr>
-              <w:t>10.0.0.160/28</w:t>
-            </w:r>
-          </w:p>
-        </w:tc>
-        <w:tc>
-          <w:tcPr>
-            <w:tcW w:type="dxa" w:w="1008"/>
-            <w:shd w:val="clear" w:color="auto" w:fill="F2F9F5"/>
-          </w:tcPr>
-          <w:p>
-            <w:r>
-              <w:rPr>
-                <w:color w:val="595959"/>
-                <w:sz w:val="18"/>
-              </w:rPr>
-              <w:t>10.1.0.160/28</w:t>
+              <w:t>avm/res/network/ddos-protection-plan</w:t>
+            </w:r>
+          </w:p>
+        </w:tc>
+        <w:tc>
+          <w:tcPr>
+            <w:tcW w:type="dxa" w:w="1584"/>
+            <w:shd w:val="clear" w:color="auto" w:fill="F2F9F5"/>
+          </w:tcPr>
+          <w:p>
+            <w:r>
+              <w:rPr>
+                <w:color w:val="595959"/>
+                <w:sz w:val="18"/>
+              </w:rPr>
+              <w:t>–</w:t>
+            </w:r>
+          </w:p>
+        </w:tc>
+        <w:tc>
+          <w:tcPr>
+            <w:tcW w:type="dxa" w:w="1440"/>
+            <w:shd w:val="clear" w:color="auto" w:fill="F2F9F5"/>
+          </w:tcPr>
+          <w:p>
+            <w:r>
+              <w:rPr>
+                <w:color w:val="595959"/>
+                <w:sz w:val="18"/>
+              </w:rPr>
+              <w:t>Zurückgestellt</w:t>
             </w:r>
           </w:p>
         </w:tc>
@@ -18479,7 +18807,22 @@
                 <w:color w:val="595959"/>
                 <w:sz w:val="18"/>
               </w:rPr>
-              <w:t>Public IP (Firewall)</w:t>
+              <w:t>Firewall Premium</w:t>
+            </w:r>
+          </w:p>
+        </w:tc>
+        <w:tc>
+          <w:tcPr>
+            <w:tcW w:type="dxa" w:w="3312"/>
+            <w:shd w:val="clear" w:color="auto" w:fill="FFFFFF"/>
+          </w:tcPr>
+          <w:p>
+            <w:r>
+              <w:rPr>
+                <w:color w:val="595959"/>
+                <w:sz w:val="18"/>
+              </w:rPr>
+              <w:t>(Upgrade, kein Rebuild)</w:t>
             </w:r>
           </w:p>
         </w:tc>
@@ -18494,52 +18837,37 @@
                 <w:color w:val="595959"/>
                 <w:sz w:val="18"/>
               </w:rPr>
-              <w:t>pip-afw-alz-&lt;r&gt;</w:t>
-            </w:r>
-          </w:p>
-        </w:tc>
-        <w:tc>
-          <w:tcPr>
-            <w:tcW w:type="dxa" w:w="3168"/>
-            <w:shd w:val="clear" w:color="auto" w:fill="FFFFFF"/>
-          </w:tcPr>
-          <w:p>
-            <w:r>
-              <w:rPr>
-                <w:color w:val="595959"/>
-                <w:sz w:val="18"/>
-              </w:rPr>
-              <w:t>avm/res/network/public-ip-address</w:t>
-            </w:r>
-          </w:p>
-        </w:tc>
-        <w:tc>
-          <w:tcPr>
-            <w:tcW w:type="dxa" w:w="1872"/>
-            <w:shd w:val="clear" w:color="auto" w:fill="FFFFFF"/>
-          </w:tcPr>
-          <w:p>
-            <w:r>
-              <w:rPr>
-                <w:color w:val="595959"/>
-                <w:sz w:val="18"/>
-              </w:rPr>
-              <w:t>Zone-redundant</w:t>
-            </w:r>
-          </w:p>
-        </w:tc>
-        <w:tc>
-          <w:tcPr>
-            <w:tcW w:type="dxa" w:w="1008"/>
-            <w:shd w:val="clear" w:color="auto" w:fill="FFFFFF"/>
-          </w:tcPr>
-          <w:p>
-            <w:r>
-              <w:rPr>
-                <w:color w:val="595959"/>
-                <w:sz w:val="18"/>
-              </w:rPr>
-              <w:t>Zone-redundant</w:t>
+              <w:t>avm/res/network/azure-firewall</w:t>
+            </w:r>
+          </w:p>
+        </w:tc>
+        <w:tc>
+          <w:tcPr>
+            <w:tcW w:type="dxa" w:w="1584"/>
+            <w:shd w:val="clear" w:color="auto" w:fill="FFFFFF"/>
+          </w:tcPr>
+          <w:p>
+            <w:r>
+              <w:rPr>
+                <w:color w:val="595959"/>
+                <w:sz w:val="18"/>
+              </w:rPr>
+              <w:t>In-Place</w:t>
+            </w:r>
+          </w:p>
+        </w:tc>
+        <w:tc>
+          <w:tcPr>
+            <w:tcW w:type="dxa" w:w="1440"/>
+            <w:shd w:val="clear" w:color="auto" w:fill="FFFFFF"/>
+          </w:tcPr>
+          <w:p>
+            <w:r>
+              <w:rPr>
+                <w:color w:val="595959"/>
+                <w:sz w:val="18"/>
+              </w:rPr>
+              <w:t>Zurückgestellt</w:t>
             </w:r>
           </w:p>
         </w:tc>
@@ -18556,7 +18884,22 @@
                 <w:color w:val="595959"/>
                 <w:sz w:val="18"/>
               </w:rPr>
-              <w:t>Public IP (Bastion)</w:t>
+              <w:t>Sekundärer Hub (opt.)</w:t>
+            </w:r>
+          </w:p>
+        </w:tc>
+        <w:tc>
+          <w:tcPr>
+            <w:tcW w:type="dxa" w:w="3312"/>
+            <w:shd w:val="clear" w:color="auto" w:fill="F2F9F5"/>
+          </w:tcPr>
+          <w:p>
+            <w:r>
+              <w:rPr>
+                <w:color w:val="595959"/>
+                <w:sz w:val="18"/>
+              </w:rPr>
+              <w:t>vnet-alz-&lt;region&gt;</w:t>
             </w:r>
           </w:p>
         </w:tc>
@@ -18571,206 +18914,37 @@
                 <w:color w:val="595959"/>
                 <w:sz w:val="18"/>
               </w:rPr>
-              <w:t>pip-bas-alz-&lt;r&gt;</w:t>
-            </w:r>
-          </w:p>
-        </w:tc>
-        <w:tc>
-          <w:tcPr>
-            <w:tcW w:type="dxa" w:w="3168"/>
-            <w:shd w:val="clear" w:color="auto" w:fill="F2F9F5"/>
-          </w:tcPr>
-          <w:p>
-            <w:r>
-              <w:rPr>
-                <w:color w:val="595959"/>
-                <w:sz w:val="18"/>
-              </w:rPr>
-              <w:t>avm/res/network/public-ip-address</w:t>
-            </w:r>
-          </w:p>
-        </w:tc>
-        <w:tc>
-          <w:tcPr>
-            <w:tcW w:type="dxa" w:w="1872"/>
-            <w:shd w:val="clear" w:color="auto" w:fill="F2F9F5"/>
-          </w:tcPr>
-          <w:p>
-            <w:r>
-              <w:rPr>
-                <w:color w:val="595959"/>
-                <w:sz w:val="18"/>
-              </w:rPr>
-              <w:t>Zone-redundant</w:t>
-            </w:r>
-          </w:p>
-        </w:tc>
-        <w:tc>
-          <w:tcPr>
-            <w:tcW w:type="dxa" w:w="1008"/>
-            <w:shd w:val="clear" w:color="auto" w:fill="F2F9F5"/>
-          </w:tcPr>
-          <w:p>
-            <w:r>
-              <w:rPr>
-                <w:color w:val="595959"/>
-                <w:sz w:val="18"/>
-              </w:rPr>
-              <w:t>Zone-redundant</w:t>
-            </w:r>
-          </w:p>
-        </w:tc>
-      </w:tr>
-      <w:tr>
-        <w:tc>
-          <w:tcPr>
-            <w:tcW w:type="dxa" w:w="2592"/>
-            <w:shd w:val="clear" w:color="auto" w:fill="FFFFFF"/>
-          </w:tcPr>
-          <w:p>
-            <w:r>
-              <w:rPr>
-                <w:color w:val="595959"/>
-                <w:sz w:val="18"/>
-              </w:rPr>
-              <w:t>Public IP (VPN GW)</w:t>
-            </w:r>
-          </w:p>
-        </w:tc>
-        <w:tc>
-          <w:tcPr>
-            <w:tcW w:type="dxa" w:w="2880"/>
-            <w:shd w:val="clear" w:color="auto" w:fill="FFFFFF"/>
-          </w:tcPr>
-          <w:p>
-            <w:r>
-              <w:rPr>
-                <w:color w:val="595959"/>
-                <w:sz w:val="18"/>
-              </w:rPr>
-              <w:t>pip-vpngw-alz-&lt;r&gt;</w:t>
-            </w:r>
-          </w:p>
-        </w:tc>
-        <w:tc>
-          <w:tcPr>
-            <w:tcW w:type="dxa" w:w="3168"/>
-            <w:shd w:val="clear" w:color="auto" w:fill="FFFFFF"/>
-          </w:tcPr>
-          <w:p>
-            <w:r>
-              <w:rPr>
-                <w:color w:val="595959"/>
-                <w:sz w:val="18"/>
-              </w:rPr>
-              <w:t>avm/res/network/public-ip-address</w:t>
-            </w:r>
-          </w:p>
-        </w:tc>
-        <w:tc>
-          <w:tcPr>
-            <w:tcW w:type="dxa" w:w="1872"/>
-            <w:shd w:val="clear" w:color="auto" w:fill="FFFFFF"/>
-          </w:tcPr>
-          <w:p>
-            <w:r>
-              <w:rPr>
-                <w:color w:val="595959"/>
-                <w:sz w:val="18"/>
-              </w:rPr>
-              <w:t>Zone-redundant</w:t>
-            </w:r>
-          </w:p>
-        </w:tc>
-        <w:tc>
-          <w:tcPr>
-            <w:tcW w:type="dxa" w:w="1008"/>
-            <w:shd w:val="clear" w:color="auto" w:fill="FFFFFF"/>
-          </w:tcPr>
-          <w:p>
-            <w:r>
-              <w:rPr>
-                <w:color w:val="595959"/>
-                <w:sz w:val="18"/>
-              </w:rPr>
-              <w:t>Zone-redundant</w:t>
-            </w:r>
-          </w:p>
-        </w:tc>
-      </w:tr>
-      <w:tr>
-        <w:tc>
-          <w:tcPr>
-            <w:tcW w:type="dxa" w:w="2592"/>
-            <w:shd w:val="clear" w:color="auto" w:fill="F2F9F5"/>
-          </w:tcPr>
-          <w:p>
-            <w:r>
-              <w:rPr>
-                <w:color w:val="595959"/>
-                <w:sz w:val="18"/>
-              </w:rPr>
-              <w:t>DDoS Protection Plan</w:t>
-            </w:r>
-          </w:p>
-        </w:tc>
-        <w:tc>
-          <w:tcPr>
-            <w:tcW w:type="dxa" w:w="2880"/>
-            <w:shd w:val="clear" w:color="auto" w:fill="F2F9F5"/>
-          </w:tcPr>
-          <w:p>
-            <w:r>
-              <w:rPr>
-                <w:color w:val="595959"/>
-                <w:sz w:val="18"/>
-              </w:rPr>
-              <w:t>ddos-alz</w:t>
-            </w:r>
-          </w:p>
-        </w:tc>
-        <w:tc>
-          <w:tcPr>
-            <w:tcW w:type="dxa" w:w="3168"/>
-            <w:shd w:val="clear" w:color="auto" w:fill="F2F9F5"/>
-          </w:tcPr>
-          <w:p>
-            <w:r>
-              <w:rPr>
-                <w:color w:val="595959"/>
-                <w:sz w:val="18"/>
-              </w:rPr>
-              <w:t>avm/res/network/ddos-protection-plan</w:t>
-            </w:r>
-          </w:p>
-        </w:tc>
-        <w:tc>
-          <w:tcPr>
-            <w:tcW w:type="dxa" w:w="1872"/>
-            <w:shd w:val="clear" w:color="auto" w:fill="F2F9F5"/>
-          </w:tcPr>
-          <w:p>
-            <w:r>
-              <w:rPr>
-                <w:color w:val="595959"/>
-                <w:sz w:val="18"/>
-              </w:rPr>
-              <w:t>Region-unabhängig</w:t>
-            </w:r>
-          </w:p>
-        </w:tc>
-        <w:tc>
-          <w:tcPr>
-            <w:tcW w:type="dxa" w:w="1008"/>
-            <w:shd w:val="clear" w:color="auto" w:fill="F2F9F5"/>
-          </w:tcPr>
-          <w:p>
-            <w:r>
-              <w:rPr>
-                <w:color w:val="595959"/>
-                <w:sz w:val="18"/>
-              </w:rPr>
-              <w:t>–</w:t>
+              <w:t>avm/res/network/virtual-network</w:t>
+            </w:r>
+          </w:p>
+        </w:tc>
+        <w:tc>
+          <w:tcPr>
+            <w:tcW w:type="dxa" w:w="1584"/>
+            <w:shd w:val="clear" w:color="auto" w:fill="F2F9F5"/>
+          </w:tcPr>
+          <w:p>
+            <w:r>
+              <w:rPr>
+                <w:color w:val="595959"/>
+                <w:sz w:val="18"/>
+              </w:rPr>
+              <w:t>10.1.0.0/22</w:t>
+            </w:r>
+          </w:p>
+        </w:tc>
+        <w:tc>
+          <w:tcPr>
+            <w:tcW w:type="dxa" w:w="1440"/>
+            <w:shd w:val="clear" w:color="auto" w:fill="F2F9F5"/>
+          </w:tcPr>
+          <w:p>
+            <w:r>
+              <w:rPr>
+                <w:color w:val="595959"/>
+                <w:sz w:val="18"/>
+              </w:rPr>
+              <w:t>Nur Variante D</w:t>
             </w:r>
           </w:p>
         </w:tc>

</xml_diff>

<commit_message>
Remove alz-decommissioned – nicht im 7-MG-Minimalmodell
MG-Zahl 8 → 7, Deployment-Schritt 1e entfernt, §2.8 aus Referenz gelöscht.
Alle Dokumente und Konfig-Dateien aktualisiert.

Co-Authored-By: Claude Sonnet 4.6 <noreply@anthropic.com>
Claude-Session: https://claude.ai/code/session_01DSkzcxBS9BsVaThtWgrZPV
</commit_message>
<xml_diff>
--- a/docs/konzept/Word/Azure-Landing-Zone-ALZ-Referenz.docx
+++ b/docs/konzept/Word/Azure-Landing-Zone-ALZ-Referenz.docx
@@ -36,7 +36,7 @@
         <w:pStyle w:val="Heading1"/>
       </w:pPr>
       <w:r>
-        <w:t>1. Management Groups (8)</w:t>
+        <w:t>1. Management Groups (7)</w:t>
       </w:r>
     </w:p>
     <w:p>
@@ -46,7 +46,7 @@
           <w:color w:val="595959"/>
           <w:sz w:val="22"/>
         </w:rPr>
-        <w:t>Der ALZ Bicep Accelerator erstellt eine standardisierte Hierarchie von 8 Management Groups unterhalb des Tenant Root. Jede MG definiert einen Vertrauensbereich mit eigenem Policy- und RBAC-Scope. Kind-MGs erben alle Assignments der Eltern-MG.</w:t>
+        <w:t>Der ALZ Bicep Accelerator erstellt eine standardisierte Hierarchie von 7 Management Groups unterhalb des Tenant Root. Jede MG definiert einen Vertrauensbereich mit eigenem Policy- und RBAC-Scope. Kind-MGs erben alle Assignments der Eltern-MG.</w:t>
       </w:r>
     </w:p>
     <w:tbl>
@@ -561,68 +561,6 @@
           </w:p>
         </w:tc>
       </w:tr>
-      <w:tr>
-        <w:tc>
-          <w:tcPr>
-            <w:tcW w:type="dxa" w:w="2736"/>
-            <w:shd w:val="clear" w:color="auto" w:fill="FFFFFF"/>
-          </w:tcPr>
-          <w:p>
-            <w:r>
-              <w:rPr>
-                <w:color w:val="595959"/>
-                <w:sz w:val="18"/>
-              </w:rPr>
-              <w:t>alz-decommissioned</w:t>
-            </w:r>
-          </w:p>
-        </w:tc>
-        <w:tc>
-          <w:tcPr>
-            <w:tcW w:type="dxa" w:w="2448"/>
-            <w:shd w:val="clear" w:color="auto" w:fill="FFFFFF"/>
-          </w:tcPr>
-          <w:p>
-            <w:r>
-              <w:rPr>
-                <w:color w:val="595959"/>
-                <w:sz w:val="18"/>
-              </w:rPr>
-              <w:t>Decommissioned</w:t>
-            </w:r>
-          </w:p>
-        </w:tc>
-        <w:tc>
-          <w:tcPr>
-            <w:tcW w:type="dxa" w:w="2304"/>
-            <w:shd w:val="clear" w:color="auto" w:fill="FFFFFF"/>
-          </w:tcPr>
-          <w:p>
-            <w:r>
-              <w:rPr>
-                <w:color w:val="595959"/>
-                <w:sz w:val="18"/>
-              </w:rPr>
-              <w:t>alz</w:t>
-            </w:r>
-          </w:p>
-        </w:tc>
-        <w:tc>
-          <w:tcPr>
-            <w:tcW w:type="dxa" w:w="4032"/>
-            <w:shd w:val="clear" w:color="auto" w:fill="FFFFFF"/>
-          </w:tcPr>
-          <w:p>
-            <w:r>
-              <w:rPr>
-                <w:color w:val="595959"/>
-                <w:sz w:val="18"/>
-              </w:rPr>
-              <w:t>Stilllegungszone; Resource-Erstellung gesperrt</w:t>
-            </w:r>
-          </w:p>
-        </w:tc>
-      </w:tr>
     </w:tbl>
     <w:p/>
     <w:p>
@@ -638,7 +576,7 @@
           <w:color w:val="595959"/>
           <w:sz w:val="18"/>
         </w:rPr>
-        <w:t>Policy-Vererbung: Assignments auf 'alz' gelten für alle 7 Kind-MGs. Assignments auf 'alz-platform' gelten für connectivity. Assignments auf 'alz-landingzones' gelten für corp. Nicht genutzte MG-Ebenen (identity, management, security, online, local) wurden bewusst weggelassen – bei Bedarf erweiterbar.</w:t>
+        <w:t>Policy-Vererbung: Assignments auf 'alz' gelten für alle 5 Kind-MGs. Assignments auf 'alz-platform' gelten für connectivity. Assignments auf 'alz-landingzones' gelten für corp. Nicht genutzte MG-Ebenen (identity, management, security, online, local) wurden bewusst weggelassen – bei Bedarf erweiterbar.</w:t>
       </w:r>
     </w:p>
     <w:p>
@@ -6990,124 +6928,6 @@
     </w:tbl>
     <w:p/>
     <w:p>
-      <w:pPr>
-        <w:pStyle w:val="Heading2"/>
-      </w:pPr>
-      <w:r>
-        <w:t>2.8 alz-decommissioned – 1 Assignment</w:t>
-      </w:r>
-    </w:p>
-    <w:tbl>
-      <w:tblPr>
-        <w:tblStyle w:val="TableGrid"/>
-        <w:tblW w:type="auto" w:w="0"/>
-        <w:tblLook w:firstColumn="1" w:firstRow="1" w:lastColumn="0" w:lastRow="0" w:noHBand="0" w:noVBand="1" w:val="04A0"/>
-      </w:tblPr>
-      <w:tblGrid>
-        <w:gridCol w:w="2948"/>
-        <w:gridCol w:w="2948"/>
-        <w:gridCol w:w="2948"/>
-      </w:tblGrid>
-      <w:tr>
-        <w:tc>
-          <w:tcPr>
-            <w:tcW w:type="dxa" w:w="3600"/>
-            <w:shd w:val="clear" w:color="auto" w:fill="053B25"/>
-          </w:tcPr>
-          <w:p>
-            <w:r>
-              <w:rPr>
-                <w:b/>
-                <w:color w:val="FFFFFF"/>
-                <w:sz w:val="18"/>
-              </w:rPr>
-              <w:t>Assignment-Name</w:t>
-            </w:r>
-          </w:p>
-        </w:tc>
-        <w:tc>
-          <w:tcPr>
-            <w:tcW w:type="dxa" w:w="1152"/>
-            <w:shd w:val="clear" w:color="auto" w:fill="053B25"/>
-          </w:tcPr>
-          <w:p>
-            <w:r>
-              <w:rPr>
-                <w:b/>
-                <w:color w:val="FFFFFF"/>
-                <w:sz w:val="18"/>
-              </w:rPr>
-              <w:t>Typ</w:t>
-            </w:r>
-          </w:p>
-        </w:tc>
-        <w:tc>
-          <w:tcPr>
-            <w:tcW w:type="dxa" w:w="6768"/>
-            <w:shd w:val="clear" w:color="auto" w:fill="053B25"/>
-          </w:tcPr>
-          <w:p>
-            <w:r>
-              <w:rPr>
-                <w:b/>
-                <w:color w:val="FFFFFF"/>
-                <w:sz w:val="18"/>
-              </w:rPr>
-              <w:t>Effekt</w:t>
-            </w:r>
-          </w:p>
-        </w:tc>
-      </w:tr>
-      <w:tr>
-        <w:tc>
-          <w:tcPr>
-            <w:tcW w:type="dxa" w:w="3600"/>
-            <w:shd w:val="clear" w:color="auto" w:fill="F2F9F5"/>
-          </w:tcPr>
-          <w:p>
-            <w:r>
-              <w:rPr>
-                <w:color w:val="595959"/>
-                <w:sz w:val="18"/>
-              </w:rPr>
-              <w:t>Enforce-ALZ-Decomm</w:t>
-            </w:r>
-          </w:p>
-        </w:tc>
-        <w:tc>
-          <w:tcPr>
-            <w:tcW w:type="dxa" w:w="1152"/>
-            <w:shd w:val="clear" w:color="auto" w:fill="F2F9F5"/>
-          </w:tcPr>
-          <w:p>
-            <w:r>
-              <w:rPr>
-                <w:color w:val="595959"/>
-                <w:sz w:val="18"/>
-              </w:rPr>
-              <w:t>Initiative</w:t>
-            </w:r>
-          </w:p>
-        </w:tc>
-        <w:tc>
-          <w:tcPr>
-            <w:tcW w:type="dxa" w:w="6768"/>
-            <w:shd w:val="clear" w:color="auto" w:fill="F2F9F5"/>
-          </w:tcPr>
-          <w:p>
-            <w:r>
-              <w:rPr>
-                <w:color w:val="595959"/>
-                <w:sz w:val="18"/>
-              </w:rPr>
-              <w:t>Deny – Keine neue Ressourcen-Erstellung; vorhandene Ressourcen bleiben bestehen</w:t>
-            </w:r>
-          </w:p>
-        </w:tc>
-      </w:tr>
-    </w:tbl>
-    <w:p/>
-    <w:p>
       <w:r>
         <w:br w:type="page"/>
       </w:r>
@@ -14278,7 +14098,7 @@
                 <w:color w:val="595959"/>
                 <w:sz w:val="18"/>
               </w:rPr>
-              <w:t>Enforce-ALZ-Decomm</w:t>
+              <w:t>Enforce-ALZ-Sandbox</w:t>
             </w:r>
           </w:p>
         </w:tc>
@@ -14293,7 +14113,7 @@
                 <w:color w:val="595959"/>
                 <w:sz w:val="18"/>
               </w:rPr>
-              <w:t>2 Policies (Deny Compute, Deny Resource Creation)</w:t>
+              <w:t>2 Policies (Deny ER/VPN, Deny Prod-Ressourcen)</w:t>
             </w:r>
           </w:p>
         </w:tc>
@@ -14308,7 +14128,7 @@
                 <w:color w:val="595959"/>
                 <w:sz w:val="18"/>
               </w:rPr>
-              <w:t>alz-decommissioned</w:t>
+              <w:t>alz-sandbox</w:t>
             </w:r>
           </w:p>
         </w:tc>
@@ -14325,7 +14145,7 @@
                 <w:color w:val="595959"/>
                 <w:sz w:val="18"/>
               </w:rPr>
-              <w:t>Enforce-ALZ-Sandbox</w:t>
+              <w:t>Enforce-ALDO-Services</w:t>
             </w:r>
           </w:p>
         </w:tc>
@@ -14340,7 +14160,7 @@
                 <w:color w:val="595959"/>
                 <w:sz w:val="18"/>
               </w:rPr>
-              <w:t>2 Policies (Deny ER/VPN, Deny Prod-Ressourcen)</w:t>
+              <w:t>~5 Policies (Azure Local / Sovereign Services)</w:t>
             </w:r>
           </w:p>
         </w:tc>
@@ -14355,7 +14175,7 @@
                 <w:color w:val="595959"/>
                 <w:sz w:val="18"/>
               </w:rPr>
-              <w:t>alz-sandbox</w:t>
+              <w:t>alz-landingzones-local</w:t>
             </w:r>
           </w:p>
         </w:tc>
@@ -14372,7 +14192,7 @@
                 <w:color w:val="595959"/>
                 <w:sz w:val="18"/>
               </w:rPr>
-              <w:t>Enforce-ALDO-Services</w:t>
+              <w:t>Enforce-Guardrails-APIM</w:t>
             </w:r>
           </w:p>
         </w:tc>
@@ -14387,7 +14207,7 @@
                 <w:color w:val="595959"/>
                 <w:sz w:val="18"/>
               </w:rPr>
-              <w:t>~5 Policies (Azure Local / Sovereign Services)</w:t>
+              <w:t>~6 Policies (TLS, Private, WAF, SKU-Check)</w:t>
             </w:r>
           </w:p>
         </w:tc>
@@ -14402,7 +14222,7 @@
                 <w:color w:val="595959"/>
                 <w:sz w:val="18"/>
               </w:rPr>
-              <w:t>alz-landingzones-local</w:t>
+              <w:t>alz-landingzones, alz-platform</w:t>
             </w:r>
           </w:p>
         </w:tc>
@@ -14419,7 +14239,7 @@
                 <w:color w:val="595959"/>
                 <w:sz w:val="18"/>
               </w:rPr>
-              <w:t>Enforce-Guardrails-APIM</w:t>
+              <w:t>Enforce-Guardrails-AppServices</w:t>
             </w:r>
           </w:p>
         </w:tc>
@@ -14434,7 +14254,7 @@
                 <w:color w:val="595959"/>
                 <w:sz w:val="18"/>
               </w:rPr>
-              <w:t>~6 Policies (TLS, Private, WAF, SKU-Check)</w:t>
+              <w:t>~8 Policies (TLS, HTTPS, Auth, Remote Debug, Slots)</w:t>
             </w:r>
           </w:p>
         </w:tc>
@@ -14466,7 +14286,7 @@
                 <w:color w:val="595959"/>
                 <w:sz w:val="18"/>
               </w:rPr>
-              <w:t>Enforce-Guardrails-AppServices</w:t>
+              <w:t>Enforce-Guardrails-Automation</w:t>
             </w:r>
           </w:p>
         </w:tc>
@@ -14481,7 +14301,7 @@
                 <w:color w:val="595959"/>
                 <w:sz w:val="18"/>
               </w:rPr>
-              <w:t>~8 Policies (TLS, HTTPS, Auth, Remote Debug, Slots)</w:t>
+              <w:t>~4 Policies (Public Access, Managed Identity, TLS)</w:t>
             </w:r>
           </w:p>
         </w:tc>
@@ -14513,7 +14333,7 @@
                 <w:color w:val="595959"/>
                 <w:sz w:val="18"/>
               </w:rPr>
-              <w:t>Enforce-Guardrails-Automation</w:t>
+              <w:t>Enforce-Guardrails-CognitiveServices</w:t>
             </w:r>
           </w:p>
         </w:tc>
@@ -14528,7 +14348,7 @@
                 <w:color w:val="595959"/>
                 <w:sz w:val="18"/>
               </w:rPr>
-              <w:t>~4 Policies (Public Access, Managed Identity, TLS)</w:t>
+              <w:t>~6 Policies (Public Network, CMK, SKU, Outbound)</w:t>
             </w:r>
           </w:p>
         </w:tc>
@@ -14560,7 +14380,7 @@
                 <w:color w:val="595959"/>
                 <w:sz w:val="18"/>
               </w:rPr>
-              <w:t>Enforce-Guardrails-CognitiveServices</w:t>
+              <w:t>Enforce-Guardrails-ContainerApps</w:t>
             </w:r>
           </w:p>
         </w:tc>
@@ -14575,7 +14395,7 @@
                 <w:color w:val="595959"/>
                 <w:sz w:val="18"/>
               </w:rPr>
-              <w:t>~6 Policies (Public Network, CMK, SKU, Outbound)</w:t>
+              <w:t>~5 Policies (Auth, Managed Identity, Ingress)</w:t>
             </w:r>
           </w:p>
         </w:tc>
@@ -14607,7 +14427,7 @@
                 <w:color w:val="595959"/>
                 <w:sz w:val="18"/>
               </w:rPr>
-              <w:t>Enforce-Guardrails-ContainerApps</w:t>
+              <w:t>Enforce-Guardrails-ContainerInstance</w:t>
             </w:r>
           </w:p>
         </w:tc>
@@ -14622,7 +14442,7 @@
                 <w:color w:val="595959"/>
                 <w:sz w:val="18"/>
               </w:rPr>
-              <w:t>~5 Policies (Auth, Managed Identity, Ingress)</w:t>
+              <w:t>~3 Policies (Public IP, Managed Identity)</w:t>
             </w:r>
           </w:p>
         </w:tc>
@@ -14654,7 +14474,7 @@
                 <w:color w:val="595959"/>
                 <w:sz w:val="18"/>
               </w:rPr>
-              <w:t>Enforce-Guardrails-ContainerInstance</w:t>
+              <w:t>Enforce-Guardrails-ContainerRegistry</w:t>
             </w:r>
           </w:p>
         </w:tc>
@@ -14669,7 +14489,7 @@
                 <w:color w:val="595959"/>
                 <w:sz w:val="18"/>
               </w:rPr>
-              <w:t>~3 Policies (Public IP, Managed Identity)</w:t>
+              <w:t>~6 Policies (Public Access, Admin, Geo-Replication, CMK)</w:t>
             </w:r>
           </w:p>
         </w:tc>
@@ -14701,7 +14521,7 @@
                 <w:color w:val="595959"/>
                 <w:sz w:val="18"/>
               </w:rPr>
-              <w:t>Enforce-Guardrails-ContainerRegistry</w:t>
+              <w:t>Enforce-Guardrails-CosmosDb</w:t>
             </w:r>
           </w:p>
         </w:tc>
@@ -14716,7 +14536,7 @@
                 <w:color w:val="595959"/>
                 <w:sz w:val="18"/>
               </w:rPr>
-              <w:t>~6 Policies (Public Access, Admin, Geo-Replication, CMK)</w:t>
+              <w:t>~5 Policies (Public Access, CMK, CORS, TLS)</w:t>
             </w:r>
           </w:p>
         </w:tc>
@@ -14748,7 +14568,7 @@
                 <w:color w:val="595959"/>
                 <w:sz w:val="18"/>
               </w:rPr>
-              <w:t>Enforce-Guardrails-CosmosDb</w:t>
+              <w:t>Enforce-Guardrails-DataExplorer</w:t>
             </w:r>
           </w:p>
         </w:tc>
@@ -14763,7 +14583,7 @@
                 <w:color w:val="595959"/>
                 <w:sz w:val="18"/>
               </w:rPr>
-              <w:t>~5 Policies (Public Access, CMK, CORS, TLS)</w:t>
+              <w:t>~4 Policies (Public Access, SKU, Disk Encryption)</w:t>
             </w:r>
           </w:p>
         </w:tc>
@@ -14795,7 +14615,7 @@
                 <w:color w:val="595959"/>
                 <w:sz w:val="18"/>
               </w:rPr>
-              <w:t>Enforce-Guardrails-DataExplorer</w:t>
+              <w:t>Enforce-Guardrails-DataFactory</w:t>
             </w:r>
           </w:p>
         </w:tc>
@@ -14810,7 +14630,7 @@
                 <w:color w:val="595959"/>
                 <w:sz w:val="18"/>
               </w:rPr>
-              <w:t>~4 Policies (Public Access, SKU, Disk Encryption)</w:t>
+              <w:t>~5 Policies (Public Access, Managed Identity, CMK, Git)</w:t>
             </w:r>
           </w:p>
         </w:tc>
@@ -14842,7 +14662,7 @@
                 <w:color w:val="595959"/>
                 <w:sz w:val="18"/>
               </w:rPr>
-              <w:t>Enforce-Guardrails-DataFactory</w:t>
+              <w:t>Enforce-Guardrails-EventGrid</w:t>
             </w:r>
           </w:p>
         </w:tc>
@@ -14857,7 +14677,7 @@
                 <w:color w:val="595959"/>
                 <w:sz w:val="18"/>
               </w:rPr>
-              <w:t>~5 Policies (Public Access, Managed Identity, CMK, Git)</w:t>
+              <w:t>~4 Policies (Public Access, Managed Identity, SKU)</w:t>
             </w:r>
           </w:p>
         </w:tc>
@@ -14889,7 +14709,7 @@
                 <w:color w:val="595959"/>
                 <w:sz w:val="18"/>
               </w:rPr>
-              <w:t>Enforce-Guardrails-EventGrid</w:t>
+              <w:t>Enforce-Guardrails-EventHub</w:t>
             </w:r>
           </w:p>
         </w:tc>
@@ -14904,7 +14724,7 @@
                 <w:color w:val="595959"/>
                 <w:sz w:val="18"/>
               </w:rPr>
-              <w:t>~4 Policies (Public Access, Managed Identity, SKU)</w:t>
+              <w:t>~5 Policies (CMK, TLS, Public Access, Double Encryption)</w:t>
             </w:r>
           </w:p>
         </w:tc>
@@ -14936,7 +14756,7 @@
                 <w:color w:val="595959"/>
                 <w:sz w:val="18"/>
               </w:rPr>
-              <w:t>Enforce-Guardrails-EventHub</w:t>
+              <w:t>Enforce-Guardrails-KeyVault</w:t>
             </w:r>
           </w:p>
         </w:tc>
@@ -14951,7 +14771,7 @@
                 <w:color w:val="595959"/>
                 <w:sz w:val="18"/>
               </w:rPr>
-              <w:t>~5 Policies (CMK, TLS, Public Access, Double Encryption)</w:t>
+              <w:t>~6 Policies (Soft Delete, Purge Protection, Firewall, RBAC)</w:t>
             </w:r>
           </w:p>
         </w:tc>
@@ -14983,7 +14803,7 @@
                 <w:color w:val="595959"/>
                 <w:sz w:val="18"/>
               </w:rPr>
-              <w:t>Enforce-Guardrails-KeyVault</w:t>
+              <w:t>Enforce-Guardrails-Kubernetes</w:t>
             </w:r>
           </w:p>
         </w:tc>
@@ -14998,7 +14818,7 @@
                 <w:color w:val="595959"/>
                 <w:sz w:val="18"/>
               </w:rPr>
-              <w:t>~6 Policies (Soft Delete, Purge Protection, Firewall, RBAC)</w:t>
+              <w:t>~8 Policies (API Server, Ingress, Privileged Pods, Audit)</w:t>
             </w:r>
           </w:p>
         </w:tc>
@@ -15030,7 +14850,7 @@
                 <w:color w:val="595959"/>
                 <w:sz w:val="18"/>
               </w:rPr>
-              <w:t>Enforce-Guardrails-Kubernetes</w:t>
+              <w:t>Enforce-Guardrails-MachineLearning</w:t>
             </w:r>
           </w:p>
         </w:tc>
@@ -15045,7 +14865,7 @@
                 <w:color w:val="595959"/>
                 <w:sz w:val="18"/>
               </w:rPr>
-              <w:t>~8 Policies (API Server, Ingress, Privileged Pods, Audit)</w:t>
+              <w:t>~5 Policies (Public Network, CMK, Managed Identity)</w:t>
             </w:r>
           </w:p>
         </w:tc>
@@ -15077,7 +14897,7 @@
                 <w:color w:val="595959"/>
                 <w:sz w:val="18"/>
               </w:rPr>
-              <w:t>Enforce-Guardrails-MachineLearning</w:t>
+              <w:t>Enforce-Guardrails-MariaDb</w:t>
             </w:r>
           </w:p>
         </w:tc>
@@ -15092,7 +14912,7 @@
                 <w:color w:val="595959"/>
                 <w:sz w:val="18"/>
               </w:rPr>
-              <w:t>~5 Policies (Public Network, CMK, Managed Identity)</w:t>
+              <w:t>~4 Policies (SSL, Firewall, Geo-Backup, TLS)</w:t>
             </w:r>
           </w:p>
         </w:tc>
@@ -15124,7 +14944,7 @@
                 <w:color w:val="595959"/>
                 <w:sz w:val="18"/>
               </w:rPr>
-              <w:t>Enforce-Guardrails-MariaDb</w:t>
+              <w:t>Enforce-Guardrails-MySQL</w:t>
             </w:r>
           </w:p>
         </w:tc>
@@ -15139,7 +14959,7 @@
                 <w:color w:val="595959"/>
                 <w:sz w:val="18"/>
               </w:rPr>
-              <w:t>~4 Policies (SSL, Firewall, Geo-Backup, TLS)</w:t>
+              <w:t>~5 Policies (SSL, Public Access, CMK, Audit, Backup)</w:t>
             </w:r>
           </w:p>
         </w:tc>
@@ -15171,7 +14991,7 @@
                 <w:color w:val="595959"/>
                 <w:sz w:val="18"/>
               </w:rPr>
-              <w:t>Enforce-Guardrails-MySQL</w:t>
+              <w:t>Enforce-Guardrails-Network</w:t>
             </w:r>
           </w:p>
         </w:tc>
@@ -15186,7 +15006,7 @@
                 <w:color w:val="595959"/>
                 <w:sz w:val="18"/>
               </w:rPr>
-              <w:t>~5 Policies (SSL, Public Access, CMK, Audit, Backup)</w:t>
+              <w:t>~6 Policies (NSG Flow Logs, Bastion, DDoS, FW Policy)</w:t>
             </w:r>
           </w:p>
         </w:tc>
@@ -15218,7 +15038,7 @@
                 <w:color w:val="595959"/>
                 <w:sz w:val="18"/>
               </w:rPr>
-              <w:t>Enforce-Guardrails-Network</w:t>
+              <w:t>Enforce-Guardrails-OpenAI</w:t>
             </w:r>
           </w:p>
         </w:tc>
@@ -15233,7 +15053,7 @@
                 <w:color w:val="595959"/>
                 <w:sz w:val="18"/>
               </w:rPr>
-              <w:t>~6 Policies (NSG Flow Logs, Bastion, DDoS, FW Policy)</w:t>
+              <w:t>~4 Policies (Public Access, Managed Identity, CMK)</w:t>
             </w:r>
           </w:p>
         </w:tc>
@@ -15265,7 +15085,7 @@
                 <w:color w:val="595959"/>
                 <w:sz w:val="18"/>
               </w:rPr>
-              <w:t>Enforce-Guardrails-OpenAI</w:t>
+              <w:t>Enforce-Guardrails-PostgreSQL</w:t>
             </w:r>
           </w:p>
         </w:tc>
@@ -15280,7 +15100,7 @@
                 <w:color w:val="595959"/>
                 <w:sz w:val="18"/>
               </w:rPr>
-              <w:t>~4 Policies (Public Access, Managed Identity, CMK)</w:t>
+              <w:t>~5 Policies (SSL, Public Access, CMK, Geo-Backup)</w:t>
             </w:r>
           </w:p>
         </w:tc>
@@ -15312,7 +15132,7 @@
                 <w:color w:val="595959"/>
                 <w:sz w:val="18"/>
               </w:rPr>
-              <w:t>Enforce-Guardrails-PostgreSQL</w:t>
+              <w:t>Enforce-Guardrails-ServiceBus</w:t>
             </w:r>
           </w:p>
         </w:tc>
@@ -15327,7 +15147,7 @@
                 <w:color w:val="595959"/>
                 <w:sz w:val="18"/>
               </w:rPr>
-              <w:t>~5 Policies (SSL, Public Access, CMK, Geo-Backup)</w:t>
+              <w:t>~5 Policies (Public Access, CMK, TLS, Double Encryption)</w:t>
             </w:r>
           </w:p>
         </w:tc>
@@ -15359,7 +15179,7 @@
                 <w:color w:val="595959"/>
                 <w:sz w:val="18"/>
               </w:rPr>
-              <w:t>Enforce-Guardrails-ServiceBus</w:t>
+              <w:t>Enforce-Guardrails-SQL</w:t>
             </w:r>
           </w:p>
         </w:tc>
@@ -15374,7 +15194,7 @@
                 <w:color w:val="595959"/>
                 <w:sz w:val="18"/>
               </w:rPr>
-              <w:t>~5 Policies (Public Access, CMK, TLS, Double Encryption)</w:t>
+              <w:t>~8 Policies (TDE, ATP, Auditing, AAD-Admin, FW, TLS)</w:t>
             </w:r>
           </w:p>
         </w:tc>
@@ -15406,7 +15226,7 @@
                 <w:color w:val="595959"/>
                 <w:sz w:val="18"/>
               </w:rPr>
-              <w:t>Enforce-Guardrails-SQL</w:t>
+              <w:t>Enforce-Guardrails-Storage</w:t>
             </w:r>
           </w:p>
         </w:tc>
@@ -15421,7 +15241,7 @@
                 <w:color w:val="595959"/>
                 <w:sz w:val="18"/>
               </w:rPr>
-              <w:t>~8 Policies (TDE, ATP, Auditing, AAD-Admin, FW, TLS)</w:t>
+              <w:t>~8 Policies (HTTPS, TLS, PublicAccess, SharedKey, CMK, SoftDelete)</w:t>
             </w:r>
           </w:p>
         </w:tc>
@@ -15453,7 +15273,7 @@
                 <w:color w:val="595959"/>
                 <w:sz w:val="18"/>
               </w:rPr>
-              <w:t>Enforce-Guardrails-Storage</w:t>
+              <w:t>Enforce-Guardrails-Synapse</w:t>
             </w:r>
           </w:p>
         </w:tc>
@@ -15468,7 +15288,7 @@
                 <w:color w:val="595959"/>
                 <w:sz w:val="18"/>
               </w:rPr>
-              <w:t>~8 Policies (HTTPS, TLS, PublicAccess, SharedKey, CMK, SoftDelete)</w:t>
+              <w:t>~5 Policies (CMK, Managed Identity, Public Access, Data Exfiltration)</w:t>
             </w:r>
           </w:p>
         </w:tc>
@@ -15500,7 +15320,7 @@
                 <w:color w:val="595959"/>
                 <w:sz w:val="18"/>
               </w:rPr>
-              <w:t>Enforce-Guardrails-Synapse</w:t>
+              <w:t>Enforce-Guardrails-VirtualDesktop</w:t>
             </w:r>
           </w:p>
         </w:tc>
@@ -15515,7 +15335,7 @@
                 <w:color w:val="595959"/>
                 <w:sz w:val="18"/>
               </w:rPr>
-              <w:t>~5 Policies (CMK, Managed Identity, Public Access, Data Exfiltration)</w:t>
+              <w:t>~4 Policies (Managed Identity, Session Type, Disk Encryption)</w:t>
             </w:r>
           </w:p>
         </w:tc>
@@ -15547,7 +15367,7 @@
                 <w:color w:val="595959"/>
                 <w:sz w:val="18"/>
               </w:rPr>
-              <w:t>Enforce-Guardrails-VirtualDesktop</w:t>
+              <w:t>Enforce-Guardrails-AADB2C</w:t>
             </w:r>
           </w:p>
         </w:tc>
@@ -15562,7 +15382,7 @@
                 <w:color w:val="595959"/>
                 <w:sz w:val="18"/>
               </w:rPr>
-              <w:t>~4 Policies (Managed Identity, Session Type, Disk Encryption)</w:t>
+              <w:t>~3 Policies (Tenant Isolation, Logging, GDPR)</w:t>
             </w:r>
           </w:p>
         </w:tc>
@@ -15594,7 +15414,7 @@
                 <w:color w:val="595959"/>
                 <w:sz w:val="18"/>
               </w:rPr>
-              <w:t>Enforce-Guardrails-AADB2C</w:t>
+              <w:t>DenyAction-DeleteUAMIAMA</w:t>
             </w:r>
           </w:p>
         </w:tc>
@@ -15609,7 +15429,7 @@
                 <w:color w:val="595959"/>
                 <w:sz w:val="18"/>
               </w:rPr>
-              <w:t>~3 Policies (Tenant Isolation, Logging, GDPR)</w:t>
+              <w:t>1 Policy (DenyAction Delete auf UAMI für Azure Monitor Agent)</w:t>
             </w:r>
           </w:p>
         </w:tc>
@@ -15617,53 +15437,6 @@
           <w:tcPr>
             <w:tcW w:type="dxa" w:w="3168"/>
             <w:shd w:val="clear" w:color="auto" w:fill="F2F9F5"/>
-          </w:tcPr>
-          <w:p>
-            <w:r>
-              <w:rPr>
-                <w:color w:val="595959"/>
-                <w:sz w:val="18"/>
-              </w:rPr>
-              <w:t>alz-landingzones, alz-platform</w:t>
-            </w:r>
-          </w:p>
-        </w:tc>
-      </w:tr>
-      <w:tr>
-        <w:tc>
-          <w:tcPr>
-            <w:tcW w:type="dxa" w:w="3600"/>
-            <w:shd w:val="clear" w:color="auto" w:fill="FFFFFF"/>
-          </w:tcPr>
-          <w:p>
-            <w:r>
-              <w:rPr>
-                <w:color w:val="595959"/>
-                <w:sz w:val="18"/>
-              </w:rPr>
-              <w:t>DenyAction-DeleteUAMIAMA</w:t>
-            </w:r>
-          </w:p>
-        </w:tc>
-        <w:tc>
-          <w:tcPr>
-            <w:tcW w:type="dxa" w:w="4752"/>
-            <w:shd w:val="clear" w:color="auto" w:fill="FFFFFF"/>
-          </w:tcPr>
-          <w:p>
-            <w:r>
-              <w:rPr>
-                <w:color w:val="595959"/>
-                <w:sz w:val="18"/>
-              </w:rPr>
-              <w:t>1 Policy (DenyAction Delete auf UAMI für Azure Monitor Agent)</w:t>
-            </w:r>
-          </w:p>
-        </w:tc>
-        <w:tc>
-          <w:tcPr>
-            <w:tcW w:type="dxa" w:w="3168"/>
-            <w:shd w:val="clear" w:color="auto" w:fill="FFFFFF"/>
           </w:tcPr>
           <w:p>
             <w:r>
@@ -20534,7 +20307,7 @@
                 <w:color w:val="595959"/>
                 <w:sz w:val="18"/>
               </w:rPr>
-              <w:t>alz-decommissioned</w:t>
+              <w:t>rg-alz-logging-germanywestcentral</w:t>
             </w:r>
           </w:p>
         </w:tc>
@@ -20549,7 +20322,7 @@
                 <w:color w:val="595959"/>
                 <w:sz w:val="18"/>
               </w:rPr>
-              <w:t>Management Group</w:t>
+              <w:t>Resource Group</w:t>
             </w:r>
           </w:p>
         </w:tc>
@@ -20564,7 +20337,7 @@
                 <w:color w:val="595959"/>
                 <w:sz w:val="18"/>
               </w:rPr>
-              <w:t>–</w:t>
+              <w:t>GWC</w:t>
             </w:r>
           </w:p>
         </w:tc>
@@ -20579,7 +20352,7 @@
                 <w:color w:val="595959"/>
                 <w:sz w:val="18"/>
               </w:rPr>
-              <w:t>alz</w:t>
+              <w:t>Connectivity Sub</w:t>
             </w:r>
           </w:p>
         </w:tc>
@@ -20596,29 +20369,215 @@
                 <w:color w:val="595959"/>
                 <w:sz w:val="18"/>
               </w:rPr>
+              <w:t>rg-alz-conn-germanywestcentral</w:t>
+            </w:r>
+          </w:p>
+        </w:tc>
+        <w:tc>
+          <w:tcPr>
+            <w:tcW w:type="dxa" w:w="2592"/>
+            <w:shd w:val="clear" w:color="auto" w:fill="FFFFFF"/>
+          </w:tcPr>
+          <w:p>
+            <w:r>
+              <w:rPr>
+                <w:color w:val="595959"/>
+                <w:sz w:val="18"/>
+              </w:rPr>
+              <w:t>Resource Group</w:t>
+            </w:r>
+          </w:p>
+        </w:tc>
+        <w:tc>
+          <w:tcPr>
+            <w:tcW w:type="dxa" w:w="864"/>
+            <w:shd w:val="clear" w:color="auto" w:fill="FFFFFF"/>
+          </w:tcPr>
+          <w:p>
+            <w:r>
+              <w:rPr>
+                <w:color w:val="595959"/>
+                <w:sz w:val="18"/>
+              </w:rPr>
+              <w:t>GWC</w:t>
+            </w:r>
+          </w:p>
+        </w:tc>
+        <w:tc>
+          <w:tcPr>
+            <w:tcW w:type="dxa" w:w="3744"/>
+            <w:shd w:val="clear" w:color="auto" w:fill="FFFFFF"/>
+          </w:tcPr>
+          <w:p>
+            <w:r>
+              <w:rPr>
+                <w:color w:val="595959"/>
+                <w:sz w:val="18"/>
+              </w:rPr>
+              <w:t>Connectivity Sub</w:t>
+            </w:r>
+          </w:p>
+        </w:tc>
+      </w:tr>
+      <w:tr>
+        <w:tc>
+          <w:tcPr>
+            <w:tcW w:type="dxa" w:w="4320"/>
+            <w:shd w:val="clear" w:color="auto" w:fill="F2F9F5"/>
+          </w:tcPr>
+          <w:p>
+            <w:r>
+              <w:rPr>
+                <w:color w:val="595959"/>
+                <w:sz w:val="18"/>
+              </w:rPr>
+              <w:t>rg-alz-dns-germanywestcentral</w:t>
+            </w:r>
+          </w:p>
+        </w:tc>
+        <w:tc>
+          <w:tcPr>
+            <w:tcW w:type="dxa" w:w="2592"/>
+            <w:shd w:val="clear" w:color="auto" w:fill="F2F9F5"/>
+          </w:tcPr>
+          <w:p>
+            <w:r>
+              <w:rPr>
+                <w:color w:val="595959"/>
+                <w:sz w:val="18"/>
+              </w:rPr>
+              <w:t>Resource Group</w:t>
+            </w:r>
+          </w:p>
+        </w:tc>
+        <w:tc>
+          <w:tcPr>
+            <w:tcW w:type="dxa" w:w="864"/>
+            <w:shd w:val="clear" w:color="auto" w:fill="F2F9F5"/>
+          </w:tcPr>
+          <w:p>
+            <w:r>
+              <w:rPr>
+                <w:color w:val="595959"/>
+                <w:sz w:val="18"/>
+              </w:rPr>
+              <w:t>GWC</w:t>
+            </w:r>
+          </w:p>
+        </w:tc>
+        <w:tc>
+          <w:tcPr>
+            <w:tcW w:type="dxa" w:w="3744"/>
+            <w:shd w:val="clear" w:color="auto" w:fill="F2F9F5"/>
+          </w:tcPr>
+          <w:p>
+            <w:r>
+              <w:rPr>
+                <w:color w:val="595959"/>
+                <w:sz w:val="18"/>
+              </w:rPr>
+              <w:t>Connectivity Sub</w:t>
+            </w:r>
+          </w:p>
+        </w:tc>
+      </w:tr>
+      <w:tr>
+        <w:tc>
+          <w:tcPr>
+            <w:tcW w:type="dxa" w:w="4320"/>
+            <w:shd w:val="clear" w:color="auto" w:fill="FFFFFF"/>
+          </w:tcPr>
+          <w:p>
+            <w:r>
+              <w:rPr>
+                <w:color w:val="595959"/>
+                <w:sz w:val="18"/>
+              </w:rPr>
+              <w:t>law-alz-germanywestcentral</w:t>
+            </w:r>
+          </w:p>
+        </w:tc>
+        <w:tc>
+          <w:tcPr>
+            <w:tcW w:type="dxa" w:w="2592"/>
+            <w:shd w:val="clear" w:color="auto" w:fill="FFFFFF"/>
+          </w:tcPr>
+          <w:p>
+            <w:r>
+              <w:rPr>
+                <w:color w:val="595959"/>
+                <w:sz w:val="18"/>
+              </w:rPr>
+              <w:t>Log Analytics Workspace</w:t>
+            </w:r>
+          </w:p>
+        </w:tc>
+        <w:tc>
+          <w:tcPr>
+            <w:tcW w:type="dxa" w:w="864"/>
+            <w:shd w:val="clear" w:color="auto" w:fill="FFFFFF"/>
+          </w:tcPr>
+          <w:p>
+            <w:r>
+              <w:rPr>
+                <w:color w:val="595959"/>
+                <w:sz w:val="18"/>
+              </w:rPr>
+              <w:t>GWC</w:t>
+            </w:r>
+          </w:p>
+        </w:tc>
+        <w:tc>
+          <w:tcPr>
+            <w:tcW w:type="dxa" w:w="3744"/>
+            <w:shd w:val="clear" w:color="auto" w:fill="FFFFFF"/>
+          </w:tcPr>
+          <w:p>
+            <w:r>
+              <w:rPr>
+                <w:color w:val="595959"/>
+                <w:sz w:val="18"/>
+              </w:rPr>
               <w:t>rg-alz-logging-germanywestcentral</w:t>
             </w:r>
           </w:p>
         </w:tc>
+      </w:tr>
+      <w:tr>
+        <w:tc>
+          <w:tcPr>
+            <w:tcW w:type="dxa" w:w="4320"/>
+            <w:shd w:val="clear" w:color="auto" w:fill="F2F9F5"/>
+          </w:tcPr>
+          <w:p>
+            <w:r>
+              <w:rPr>
+                <w:color w:val="595959"/>
+                <w:sz w:val="18"/>
+              </w:rPr>
+              <w:t>mi-alz-germanywestcentral</w:t>
+            </w:r>
+          </w:p>
+        </w:tc>
         <w:tc>
           <w:tcPr>
             <w:tcW w:type="dxa" w:w="2592"/>
-            <w:shd w:val="clear" w:color="auto" w:fill="FFFFFF"/>
-          </w:tcPr>
-          <w:p>
-            <w:r>
-              <w:rPr>
-                <w:color w:val="595959"/>
-                <w:sz w:val="18"/>
-              </w:rPr>
-              <w:t>Resource Group</w:t>
+            <w:shd w:val="clear" w:color="auto" w:fill="F2F9F5"/>
+          </w:tcPr>
+          <w:p>
+            <w:r>
+              <w:rPr>
+                <w:color w:val="595959"/>
+                <w:sz w:val="18"/>
+              </w:rPr>
+              <w:t>Managed Identity</w:t>
             </w:r>
           </w:p>
         </w:tc>
         <w:tc>
           <w:tcPr>
             <w:tcW w:type="dxa" w:w="864"/>
-            <w:shd w:val="clear" w:color="auto" w:fill="FFFFFF"/>
+            <w:shd w:val="clear" w:color="auto" w:fill="F2F9F5"/>
           </w:tcPr>
           <w:p>
             <w:r>
@@ -20633,15 +20592,15 @@
         <w:tc>
           <w:tcPr>
             <w:tcW w:type="dxa" w:w="3744"/>
-            <w:shd w:val="clear" w:color="auto" w:fill="FFFFFF"/>
-          </w:tcPr>
-          <w:p>
-            <w:r>
-              <w:rPr>
-                <w:color w:val="595959"/>
-                <w:sz w:val="18"/>
-              </w:rPr>
-              <w:t>Connectivity Sub</w:t>
+            <w:shd w:val="clear" w:color="auto" w:fill="F2F9F5"/>
+          </w:tcPr>
+          <w:p>
+            <w:r>
+              <w:rPr>
+                <w:color w:val="595959"/>
+                <w:sz w:val="18"/>
+              </w:rPr>
+              <w:t>rg-alz-logging-germanywestcentral</w:t>
             </w:r>
           </w:p>
         </w:tc>
@@ -20650,6 +20609,237 @@
         <w:tc>
           <w:tcPr>
             <w:tcW w:type="dxa" w:w="4320"/>
+            <w:shd w:val="clear" w:color="auto" w:fill="FFFFFF"/>
+          </w:tcPr>
+          <w:p>
+            <w:r>
+              <w:rPr>
+                <w:color w:val="595959"/>
+                <w:sz w:val="18"/>
+              </w:rPr>
+              <w:t>dcr-vmi-alz-germanywestcentral</w:t>
+            </w:r>
+          </w:p>
+        </w:tc>
+        <w:tc>
+          <w:tcPr>
+            <w:tcW w:type="dxa" w:w="2592"/>
+            <w:shd w:val="clear" w:color="auto" w:fill="FFFFFF"/>
+          </w:tcPr>
+          <w:p>
+            <w:r>
+              <w:rPr>
+                <w:color w:val="595959"/>
+                <w:sz w:val="18"/>
+              </w:rPr>
+              <w:t>Data Collection Rule</w:t>
+            </w:r>
+          </w:p>
+        </w:tc>
+        <w:tc>
+          <w:tcPr>
+            <w:tcW w:type="dxa" w:w="864"/>
+            <w:shd w:val="clear" w:color="auto" w:fill="FFFFFF"/>
+          </w:tcPr>
+          <w:p>
+            <w:r>
+              <w:rPr>
+                <w:color w:val="595959"/>
+                <w:sz w:val="18"/>
+              </w:rPr>
+              <w:t>GWC</w:t>
+            </w:r>
+          </w:p>
+        </w:tc>
+        <w:tc>
+          <w:tcPr>
+            <w:tcW w:type="dxa" w:w="3744"/>
+            <w:shd w:val="clear" w:color="auto" w:fill="FFFFFF"/>
+          </w:tcPr>
+          <w:p>
+            <w:r>
+              <w:rPr>
+                <w:color w:val="595959"/>
+                <w:sz w:val="18"/>
+              </w:rPr>
+              <w:t>rg-alz-logging-germanywestcentral</w:t>
+            </w:r>
+          </w:p>
+        </w:tc>
+      </w:tr>
+      <w:tr>
+        <w:tc>
+          <w:tcPr>
+            <w:tcW w:type="dxa" w:w="4320"/>
+            <w:shd w:val="clear" w:color="auto" w:fill="F2F9F5"/>
+          </w:tcPr>
+          <w:p>
+            <w:r>
+              <w:rPr>
+                <w:color w:val="595959"/>
+                <w:sz w:val="18"/>
+              </w:rPr>
+              <w:t>dcr-ct-alz-germanywestcentral</w:t>
+            </w:r>
+          </w:p>
+        </w:tc>
+        <w:tc>
+          <w:tcPr>
+            <w:tcW w:type="dxa" w:w="2592"/>
+            <w:shd w:val="clear" w:color="auto" w:fill="F2F9F5"/>
+          </w:tcPr>
+          <w:p>
+            <w:r>
+              <w:rPr>
+                <w:color w:val="595959"/>
+                <w:sz w:val="18"/>
+              </w:rPr>
+              <w:t>Data Collection Rule</w:t>
+            </w:r>
+          </w:p>
+        </w:tc>
+        <w:tc>
+          <w:tcPr>
+            <w:tcW w:type="dxa" w:w="864"/>
+            <w:shd w:val="clear" w:color="auto" w:fill="F2F9F5"/>
+          </w:tcPr>
+          <w:p>
+            <w:r>
+              <w:rPr>
+                <w:color w:val="595959"/>
+                <w:sz w:val="18"/>
+              </w:rPr>
+              <w:t>GWC</w:t>
+            </w:r>
+          </w:p>
+        </w:tc>
+        <w:tc>
+          <w:tcPr>
+            <w:tcW w:type="dxa" w:w="3744"/>
+            <w:shd w:val="clear" w:color="auto" w:fill="F2F9F5"/>
+          </w:tcPr>
+          <w:p>
+            <w:r>
+              <w:rPr>
+                <w:color w:val="595959"/>
+                <w:sz w:val="18"/>
+              </w:rPr>
+              <w:t>rg-alz-logging-germanywestcentral</w:t>
+            </w:r>
+          </w:p>
+        </w:tc>
+      </w:tr>
+      <w:tr>
+        <w:tc>
+          <w:tcPr>
+            <w:tcW w:type="dxa" w:w="4320"/>
+            <w:shd w:val="clear" w:color="auto" w:fill="FFFFFF"/>
+          </w:tcPr>
+          <w:p>
+            <w:r>
+              <w:rPr>
+                <w:color w:val="595959"/>
+                <w:sz w:val="18"/>
+              </w:rPr>
+              <w:t>dcr-mdfcsql-alz-germanywestcentral</w:t>
+            </w:r>
+          </w:p>
+        </w:tc>
+        <w:tc>
+          <w:tcPr>
+            <w:tcW w:type="dxa" w:w="2592"/>
+            <w:shd w:val="clear" w:color="auto" w:fill="FFFFFF"/>
+          </w:tcPr>
+          <w:p>
+            <w:r>
+              <w:rPr>
+                <w:color w:val="595959"/>
+                <w:sz w:val="18"/>
+              </w:rPr>
+              <w:t>Data Collection Rule</w:t>
+            </w:r>
+          </w:p>
+        </w:tc>
+        <w:tc>
+          <w:tcPr>
+            <w:tcW w:type="dxa" w:w="864"/>
+            <w:shd w:val="clear" w:color="auto" w:fill="FFFFFF"/>
+          </w:tcPr>
+          <w:p>
+            <w:r>
+              <w:rPr>
+                <w:color w:val="595959"/>
+                <w:sz w:val="18"/>
+              </w:rPr>
+              <w:t>GWC</w:t>
+            </w:r>
+          </w:p>
+        </w:tc>
+        <w:tc>
+          <w:tcPr>
+            <w:tcW w:type="dxa" w:w="3744"/>
+            <w:shd w:val="clear" w:color="auto" w:fill="FFFFFF"/>
+          </w:tcPr>
+          <w:p>
+            <w:r>
+              <w:rPr>
+                <w:color w:val="595959"/>
+                <w:sz w:val="18"/>
+              </w:rPr>
+              <w:t>rg-alz-logging-germanywestcentral</w:t>
+            </w:r>
+          </w:p>
+        </w:tc>
+      </w:tr>
+      <w:tr>
+        <w:tc>
+          <w:tcPr>
+            <w:tcW w:type="dxa" w:w="4320"/>
+            <w:shd w:val="clear" w:color="auto" w:fill="F2F9F5"/>
+          </w:tcPr>
+          <w:p>
+            <w:r>
+              <w:rPr>
+                <w:color w:val="595959"/>
+                <w:sz w:val="18"/>
+              </w:rPr>
+              <w:t>vnet-alz-germanywestcentral</w:t>
+            </w:r>
+          </w:p>
+        </w:tc>
+        <w:tc>
+          <w:tcPr>
+            <w:tcW w:type="dxa" w:w="2592"/>
+            <w:shd w:val="clear" w:color="auto" w:fill="F2F9F5"/>
+          </w:tcPr>
+          <w:p>
+            <w:r>
+              <w:rPr>
+                <w:color w:val="595959"/>
+                <w:sz w:val="18"/>
+              </w:rPr>
+              <w:t>Virtual Network (Hub)</w:t>
+            </w:r>
+          </w:p>
+        </w:tc>
+        <w:tc>
+          <w:tcPr>
+            <w:tcW w:type="dxa" w:w="864"/>
+            <w:shd w:val="clear" w:color="auto" w:fill="F2F9F5"/>
+          </w:tcPr>
+          <w:p>
+            <w:r>
+              <w:rPr>
+                <w:color w:val="595959"/>
+                <w:sz w:val="18"/>
+              </w:rPr>
+              <w:t>GWC</w:t>
+            </w:r>
+          </w:p>
+        </w:tc>
+        <w:tc>
+          <w:tcPr>
+            <w:tcW w:type="dxa" w:w="3744"/>
             <w:shd w:val="clear" w:color="auto" w:fill="F2F9F5"/>
           </w:tcPr>
           <w:p>
@@ -20662,25 +20852,42 @@
             </w:r>
           </w:p>
         </w:tc>
+      </w:tr>
+      <w:tr>
+        <w:tc>
+          <w:tcPr>
+            <w:tcW w:type="dxa" w:w="4320"/>
+            <w:shd w:val="clear" w:color="auto" w:fill="FFFFFF"/>
+          </w:tcPr>
+          <w:p>
+            <w:r>
+              <w:rPr>
+                <w:color w:val="595959"/>
+                <w:sz w:val="18"/>
+              </w:rPr>
+              <w:t>afw-alz-germanywestcentral</w:t>
+            </w:r>
+          </w:p>
+        </w:tc>
         <w:tc>
           <w:tcPr>
             <w:tcW w:type="dxa" w:w="2592"/>
-            <w:shd w:val="clear" w:color="auto" w:fill="F2F9F5"/>
-          </w:tcPr>
-          <w:p>
-            <w:r>
-              <w:rPr>
-                <w:color w:val="595959"/>
-                <w:sz w:val="18"/>
-              </w:rPr>
-              <w:t>Resource Group</w:t>
+            <w:shd w:val="clear" w:color="auto" w:fill="FFFFFF"/>
+          </w:tcPr>
+          <w:p>
+            <w:r>
+              <w:rPr>
+                <w:color w:val="595959"/>
+                <w:sz w:val="18"/>
+              </w:rPr>
+              <w:t>Azure Firewall</w:t>
             </w:r>
           </w:p>
         </w:tc>
         <w:tc>
           <w:tcPr>
             <w:tcW w:type="dxa" w:w="864"/>
-            <w:shd w:val="clear" w:color="auto" w:fill="F2F9F5"/>
+            <w:shd w:val="clear" w:color="auto" w:fill="FFFFFF"/>
           </w:tcPr>
           <w:p>
             <w:r>
@@ -20695,15 +20902,15 @@
         <w:tc>
           <w:tcPr>
             <w:tcW w:type="dxa" w:w="3744"/>
-            <w:shd w:val="clear" w:color="auto" w:fill="F2F9F5"/>
-          </w:tcPr>
-          <w:p>
-            <w:r>
-              <w:rPr>
-                <w:color w:val="595959"/>
-                <w:sz w:val="18"/>
-              </w:rPr>
-              <w:t>Connectivity Sub</w:t>
+            <w:shd w:val="clear" w:color="auto" w:fill="FFFFFF"/>
+          </w:tcPr>
+          <w:p>
+            <w:r>
+              <w:rPr>
+                <w:color w:val="595959"/>
+                <w:sz w:val="18"/>
+              </w:rPr>
+              <w:t>rg-alz-conn-germanywestcentral</w:t>
             </w:r>
           </w:p>
         </w:tc>
@@ -20712,37 +20919,37 @@
         <w:tc>
           <w:tcPr>
             <w:tcW w:type="dxa" w:w="4320"/>
-            <w:shd w:val="clear" w:color="auto" w:fill="FFFFFF"/>
-          </w:tcPr>
-          <w:p>
-            <w:r>
-              <w:rPr>
-                <w:color w:val="595959"/>
-                <w:sz w:val="18"/>
-              </w:rPr>
-              <w:t>rg-alz-dns-germanywestcentral</w:t>
+            <w:shd w:val="clear" w:color="auto" w:fill="F2F9F5"/>
+          </w:tcPr>
+          <w:p>
+            <w:r>
+              <w:rPr>
+                <w:color w:val="595959"/>
+                <w:sz w:val="18"/>
+              </w:rPr>
+              <w:t>afwp-alz-germanywestcentral</w:t>
             </w:r>
           </w:p>
         </w:tc>
         <w:tc>
           <w:tcPr>
             <w:tcW w:type="dxa" w:w="2592"/>
-            <w:shd w:val="clear" w:color="auto" w:fill="FFFFFF"/>
-          </w:tcPr>
-          <w:p>
-            <w:r>
-              <w:rPr>
-                <w:color w:val="595959"/>
-                <w:sz w:val="18"/>
-              </w:rPr>
-              <w:t>Resource Group</w:t>
+            <w:shd w:val="clear" w:color="auto" w:fill="F2F9F5"/>
+          </w:tcPr>
+          <w:p>
+            <w:r>
+              <w:rPr>
+                <w:color w:val="595959"/>
+                <w:sz w:val="18"/>
+              </w:rPr>
+              <w:t>Firewall Policy</w:t>
             </w:r>
           </w:p>
         </w:tc>
         <w:tc>
           <w:tcPr>
             <w:tcW w:type="dxa" w:w="864"/>
-            <w:shd w:val="clear" w:color="auto" w:fill="FFFFFF"/>
+            <w:shd w:val="clear" w:color="auto" w:fill="F2F9F5"/>
           </w:tcPr>
           <w:p>
             <w:r>
@@ -20757,15 +20964,15 @@
         <w:tc>
           <w:tcPr>
             <w:tcW w:type="dxa" w:w="3744"/>
-            <w:shd w:val="clear" w:color="auto" w:fill="FFFFFF"/>
-          </w:tcPr>
-          <w:p>
-            <w:r>
-              <w:rPr>
-                <w:color w:val="595959"/>
-                <w:sz w:val="18"/>
-              </w:rPr>
-              <w:t>Connectivity Sub</w:t>
+            <w:shd w:val="clear" w:color="auto" w:fill="F2F9F5"/>
+          </w:tcPr>
+          <w:p>
+            <w:r>
+              <w:rPr>
+                <w:color w:val="595959"/>
+                <w:sz w:val="18"/>
+              </w:rPr>
+              <w:t>rg-alz-conn-germanywestcentral</w:t>
             </w:r>
           </w:p>
         </w:tc>
@@ -20774,37 +20981,37 @@
         <w:tc>
           <w:tcPr>
             <w:tcW w:type="dxa" w:w="4320"/>
-            <w:shd w:val="clear" w:color="auto" w:fill="F2F9F5"/>
-          </w:tcPr>
-          <w:p>
-            <w:r>
-              <w:rPr>
-                <w:color w:val="595959"/>
-                <w:sz w:val="18"/>
-              </w:rPr>
-              <w:t>law-alz-germanywestcentral</w:t>
+            <w:shd w:val="clear" w:color="auto" w:fill="FFFFFF"/>
+          </w:tcPr>
+          <w:p>
+            <w:r>
+              <w:rPr>
+                <w:color w:val="595959"/>
+                <w:sz w:val="18"/>
+              </w:rPr>
+              <w:t>pip-afw-alz-germanywestcentral</w:t>
             </w:r>
           </w:p>
         </w:tc>
         <w:tc>
           <w:tcPr>
             <w:tcW w:type="dxa" w:w="2592"/>
-            <w:shd w:val="clear" w:color="auto" w:fill="F2F9F5"/>
-          </w:tcPr>
-          <w:p>
-            <w:r>
-              <w:rPr>
-                <w:color w:val="595959"/>
-                <w:sz w:val="18"/>
-              </w:rPr>
-              <w:t>Log Analytics Workspace</w:t>
+            <w:shd w:val="clear" w:color="auto" w:fill="FFFFFF"/>
+          </w:tcPr>
+          <w:p>
+            <w:r>
+              <w:rPr>
+                <w:color w:val="595959"/>
+                <w:sz w:val="18"/>
+              </w:rPr>
+              <w:t>Public IP (Firewall)</w:t>
             </w:r>
           </w:p>
         </w:tc>
         <w:tc>
           <w:tcPr>
             <w:tcW w:type="dxa" w:w="864"/>
-            <w:shd w:val="clear" w:color="auto" w:fill="F2F9F5"/>
+            <w:shd w:val="clear" w:color="auto" w:fill="FFFFFF"/>
           </w:tcPr>
           <w:p>
             <w:r>
@@ -20819,15 +21026,15 @@
         <w:tc>
           <w:tcPr>
             <w:tcW w:type="dxa" w:w="3744"/>
-            <w:shd w:val="clear" w:color="auto" w:fill="F2F9F5"/>
-          </w:tcPr>
-          <w:p>
-            <w:r>
-              <w:rPr>
-                <w:color w:val="595959"/>
-                <w:sz w:val="18"/>
-              </w:rPr>
-              <w:t>rg-alz-logging-germanywestcentral</w:t>
+            <w:shd w:val="clear" w:color="auto" w:fill="FFFFFF"/>
+          </w:tcPr>
+          <w:p>
+            <w:r>
+              <w:rPr>
+                <w:color w:val="595959"/>
+                <w:sz w:val="18"/>
+              </w:rPr>
+              <w:t>rg-alz-conn-germanywestcentral</w:t>
             </w:r>
           </w:p>
         </w:tc>
@@ -20836,37 +21043,37 @@
         <w:tc>
           <w:tcPr>
             <w:tcW w:type="dxa" w:w="4320"/>
-            <w:shd w:val="clear" w:color="auto" w:fill="FFFFFF"/>
-          </w:tcPr>
-          <w:p>
-            <w:r>
-              <w:rPr>
-                <w:color w:val="595959"/>
-                <w:sz w:val="18"/>
-              </w:rPr>
-              <w:t>mi-alz-germanywestcentral</w:t>
+            <w:shd w:val="clear" w:color="auto" w:fill="F2F9F5"/>
+          </w:tcPr>
+          <w:p>
+            <w:r>
+              <w:rPr>
+                <w:color w:val="595959"/>
+                <w:sz w:val="18"/>
+              </w:rPr>
+              <w:t>pip-afw-mgmt-alz-germanywestcentral</w:t>
             </w:r>
           </w:p>
         </w:tc>
         <w:tc>
           <w:tcPr>
             <w:tcW w:type="dxa" w:w="2592"/>
-            <w:shd w:val="clear" w:color="auto" w:fill="FFFFFF"/>
-          </w:tcPr>
-          <w:p>
-            <w:r>
-              <w:rPr>
-                <w:color w:val="595959"/>
-                <w:sz w:val="18"/>
-              </w:rPr>
-              <w:t>Managed Identity</w:t>
+            <w:shd w:val="clear" w:color="auto" w:fill="F2F9F5"/>
+          </w:tcPr>
+          <w:p>
+            <w:r>
+              <w:rPr>
+                <w:color w:val="595959"/>
+                <w:sz w:val="18"/>
+              </w:rPr>
+              <w:t>Public IP (FW Mgmt)</w:t>
             </w:r>
           </w:p>
         </w:tc>
         <w:tc>
           <w:tcPr>
             <w:tcW w:type="dxa" w:w="864"/>
-            <w:shd w:val="clear" w:color="auto" w:fill="FFFFFF"/>
+            <w:shd w:val="clear" w:color="auto" w:fill="F2F9F5"/>
           </w:tcPr>
           <w:p>
             <w:r>
@@ -20881,15 +21088,15 @@
         <w:tc>
           <w:tcPr>
             <w:tcW w:type="dxa" w:w="3744"/>
-            <w:shd w:val="clear" w:color="auto" w:fill="FFFFFF"/>
-          </w:tcPr>
-          <w:p>
-            <w:r>
-              <w:rPr>
-                <w:color w:val="595959"/>
-                <w:sz w:val="18"/>
-              </w:rPr>
-              <w:t>rg-alz-logging-germanywestcentral</w:t>
+            <w:shd w:val="clear" w:color="auto" w:fill="F2F9F5"/>
+          </w:tcPr>
+          <w:p>
+            <w:r>
+              <w:rPr>
+                <w:color w:val="595959"/>
+                <w:sz w:val="18"/>
+              </w:rPr>
+              <w:t>rg-alz-conn-germanywestcentral</w:t>
             </w:r>
           </w:p>
         </w:tc>
@@ -20898,37 +21105,37 @@
         <w:tc>
           <w:tcPr>
             <w:tcW w:type="dxa" w:w="4320"/>
-            <w:shd w:val="clear" w:color="auto" w:fill="F2F9F5"/>
-          </w:tcPr>
-          <w:p>
-            <w:r>
-              <w:rPr>
-                <w:color w:val="595959"/>
-                <w:sz w:val="18"/>
-              </w:rPr>
-              <w:t>dcr-vmi-alz-germanywestcentral</w:t>
+            <w:shd w:val="clear" w:color="auto" w:fill="FFFFFF"/>
+          </w:tcPr>
+          <w:p>
+            <w:r>
+              <w:rPr>
+                <w:color w:val="595959"/>
+                <w:sz w:val="18"/>
+              </w:rPr>
+              <w:t>bas-alz-germanywestcentral</w:t>
             </w:r>
           </w:p>
         </w:tc>
         <w:tc>
           <w:tcPr>
             <w:tcW w:type="dxa" w:w="2592"/>
-            <w:shd w:val="clear" w:color="auto" w:fill="F2F9F5"/>
-          </w:tcPr>
-          <w:p>
-            <w:r>
-              <w:rPr>
-                <w:color w:val="595959"/>
-                <w:sz w:val="18"/>
-              </w:rPr>
-              <w:t>Data Collection Rule</w:t>
+            <w:shd w:val="clear" w:color="auto" w:fill="FFFFFF"/>
+          </w:tcPr>
+          <w:p>
+            <w:r>
+              <w:rPr>
+                <w:color w:val="595959"/>
+                <w:sz w:val="18"/>
+              </w:rPr>
+              <w:t>Azure Bastion (Zurückgestellt)</w:t>
             </w:r>
           </w:p>
         </w:tc>
         <w:tc>
           <w:tcPr>
             <w:tcW w:type="dxa" w:w="864"/>
-            <w:shd w:val="clear" w:color="auto" w:fill="F2F9F5"/>
+            <w:shd w:val="clear" w:color="auto" w:fill="FFFFFF"/>
           </w:tcPr>
           <w:p>
             <w:r>
@@ -20943,15 +21150,15 @@
         <w:tc>
           <w:tcPr>
             <w:tcW w:type="dxa" w:w="3744"/>
-            <w:shd w:val="clear" w:color="auto" w:fill="F2F9F5"/>
-          </w:tcPr>
-          <w:p>
-            <w:r>
-              <w:rPr>
-                <w:color w:val="595959"/>
-                <w:sz w:val="18"/>
-              </w:rPr>
-              <w:t>rg-alz-logging-germanywestcentral</w:t>
+            <w:shd w:val="clear" w:color="auto" w:fill="FFFFFF"/>
+          </w:tcPr>
+          <w:p>
+            <w:r>
+              <w:rPr>
+                <w:color w:val="595959"/>
+                <w:sz w:val="18"/>
+              </w:rPr>
+              <w:t>rg-alz-conn-germanywestcentral</w:t>
             </w:r>
           </w:p>
         </w:tc>
@@ -20960,37 +21167,37 @@
         <w:tc>
           <w:tcPr>
             <w:tcW w:type="dxa" w:w="4320"/>
-            <w:shd w:val="clear" w:color="auto" w:fill="FFFFFF"/>
-          </w:tcPr>
-          <w:p>
-            <w:r>
-              <w:rPr>
-                <w:color w:val="595959"/>
-                <w:sz w:val="18"/>
-              </w:rPr>
-              <w:t>dcr-ct-alz-germanywestcentral</w:t>
+            <w:shd w:val="clear" w:color="auto" w:fill="F2F9F5"/>
+          </w:tcPr>
+          <w:p>
+            <w:r>
+              <w:rPr>
+                <w:color w:val="595959"/>
+                <w:sz w:val="18"/>
+              </w:rPr>
+              <w:t>vpngw-alz-germanywestcentral</w:t>
             </w:r>
           </w:p>
         </w:tc>
         <w:tc>
           <w:tcPr>
             <w:tcW w:type="dxa" w:w="2592"/>
-            <w:shd w:val="clear" w:color="auto" w:fill="FFFFFF"/>
-          </w:tcPr>
-          <w:p>
-            <w:r>
-              <w:rPr>
-                <w:color w:val="595959"/>
-                <w:sz w:val="18"/>
-              </w:rPr>
-              <w:t>Data Collection Rule</w:t>
+            <w:shd w:val="clear" w:color="auto" w:fill="F2F9F5"/>
+          </w:tcPr>
+          <w:p>
+            <w:r>
+              <w:rPr>
+                <w:color w:val="595959"/>
+                <w:sz w:val="18"/>
+              </w:rPr>
+              <w:t>VPN Gateway (Zurückgestellt)</w:t>
             </w:r>
           </w:p>
         </w:tc>
         <w:tc>
           <w:tcPr>
             <w:tcW w:type="dxa" w:w="864"/>
-            <w:shd w:val="clear" w:color="auto" w:fill="FFFFFF"/>
+            <w:shd w:val="clear" w:color="auto" w:fill="F2F9F5"/>
           </w:tcPr>
           <w:p>
             <w:r>
@@ -21005,15 +21212,15 @@
         <w:tc>
           <w:tcPr>
             <w:tcW w:type="dxa" w:w="3744"/>
-            <w:shd w:val="clear" w:color="auto" w:fill="FFFFFF"/>
-          </w:tcPr>
-          <w:p>
-            <w:r>
-              <w:rPr>
-                <w:color w:val="595959"/>
-                <w:sz w:val="18"/>
-              </w:rPr>
-              <w:t>rg-alz-logging-germanywestcentral</w:t>
+            <w:shd w:val="clear" w:color="auto" w:fill="F2F9F5"/>
+          </w:tcPr>
+          <w:p>
+            <w:r>
+              <w:rPr>
+                <w:color w:val="595959"/>
+                <w:sz w:val="18"/>
+              </w:rPr>
+              <w:t>rg-alz-conn-germanywestcentral</w:t>
             </w:r>
           </w:p>
         </w:tc>
@@ -21022,37 +21229,37 @@
         <w:tc>
           <w:tcPr>
             <w:tcW w:type="dxa" w:w="4320"/>
-            <w:shd w:val="clear" w:color="auto" w:fill="F2F9F5"/>
-          </w:tcPr>
-          <w:p>
-            <w:r>
-              <w:rPr>
-                <w:color w:val="595959"/>
-                <w:sz w:val="18"/>
-              </w:rPr>
-              <w:t>dcr-mdfcsql-alz-germanywestcentral</w:t>
+            <w:shd w:val="clear" w:color="auto" w:fill="FFFFFF"/>
+          </w:tcPr>
+          <w:p>
+            <w:r>
+              <w:rPr>
+                <w:color w:val="595959"/>
+                <w:sz w:val="18"/>
+              </w:rPr>
+              <w:t>dnspr-alz-germanywestcentral</w:t>
             </w:r>
           </w:p>
         </w:tc>
         <w:tc>
           <w:tcPr>
             <w:tcW w:type="dxa" w:w="2592"/>
-            <w:shd w:val="clear" w:color="auto" w:fill="F2F9F5"/>
-          </w:tcPr>
-          <w:p>
-            <w:r>
-              <w:rPr>
-                <w:color w:val="595959"/>
-                <w:sz w:val="18"/>
-              </w:rPr>
-              <w:t>Data Collection Rule</w:t>
+            <w:shd w:val="clear" w:color="auto" w:fill="FFFFFF"/>
+          </w:tcPr>
+          <w:p>
+            <w:r>
+              <w:rPr>
+                <w:color w:val="595959"/>
+                <w:sz w:val="18"/>
+              </w:rPr>
+              <w:t>DNS Private Resolver (Zurückgestellt)</w:t>
             </w:r>
           </w:p>
         </w:tc>
         <w:tc>
           <w:tcPr>
             <w:tcW w:type="dxa" w:w="864"/>
-            <w:shd w:val="clear" w:color="auto" w:fill="F2F9F5"/>
+            <w:shd w:val="clear" w:color="auto" w:fill="FFFFFF"/>
           </w:tcPr>
           <w:p>
             <w:r>
@@ -21067,15 +21274,15 @@
         <w:tc>
           <w:tcPr>
             <w:tcW w:type="dxa" w:w="3744"/>
-            <w:shd w:val="clear" w:color="auto" w:fill="F2F9F5"/>
-          </w:tcPr>
-          <w:p>
-            <w:r>
-              <w:rPr>
-                <w:color w:val="595959"/>
-                <w:sz w:val="18"/>
-              </w:rPr>
-              <w:t>rg-alz-logging-germanywestcentral</w:t>
+            <w:shd w:val="clear" w:color="auto" w:fill="FFFFFF"/>
+          </w:tcPr>
+          <w:p>
+            <w:r>
+              <w:rPr>
+                <w:color w:val="595959"/>
+                <w:sz w:val="18"/>
+              </w:rPr>
+              <w:t>rg-alz-conn-germanywestcentral</w:t>
             </w:r>
           </w:p>
         </w:tc>
@@ -21084,37 +21291,37 @@
         <w:tc>
           <w:tcPr>
             <w:tcW w:type="dxa" w:w="4320"/>
-            <w:shd w:val="clear" w:color="auto" w:fill="FFFFFF"/>
-          </w:tcPr>
-          <w:p>
-            <w:r>
-              <w:rPr>
-                <w:color w:val="595959"/>
-                <w:sz w:val="18"/>
-              </w:rPr>
-              <w:t>vnet-alz-germanywestcentral</w:t>
+            <w:shd w:val="clear" w:color="auto" w:fill="F2F9F5"/>
+          </w:tcPr>
+          <w:p>
+            <w:r>
+              <w:rPr>
+                <w:color w:val="595959"/>
+                <w:sz w:val="18"/>
+              </w:rPr>
+              <w:t>privatelink.blob.core.windows.net (+ 58 weitere Zonen)</w:t>
             </w:r>
           </w:p>
         </w:tc>
         <w:tc>
           <w:tcPr>
             <w:tcW w:type="dxa" w:w="2592"/>
-            <w:shd w:val="clear" w:color="auto" w:fill="FFFFFF"/>
-          </w:tcPr>
-          <w:p>
-            <w:r>
-              <w:rPr>
-                <w:color w:val="595959"/>
-                <w:sz w:val="18"/>
-              </w:rPr>
-              <w:t>Virtual Network (Hub)</w:t>
+            <w:shd w:val="clear" w:color="auto" w:fill="F2F9F5"/>
+          </w:tcPr>
+          <w:p>
+            <w:r>
+              <w:rPr>
+                <w:color w:val="595959"/>
+                <w:sz w:val="18"/>
+              </w:rPr>
+              <w:t>Private DNS Zones (59)</w:t>
             </w:r>
           </w:p>
         </w:tc>
         <w:tc>
           <w:tcPr>
             <w:tcW w:type="dxa" w:w="864"/>
-            <w:shd w:val="clear" w:color="auto" w:fill="FFFFFF"/>
+            <w:shd w:val="clear" w:color="auto" w:fill="F2F9F5"/>
           </w:tcPr>
           <w:p>
             <w:r>
@@ -21129,503 +21336,7 @@
         <w:tc>
           <w:tcPr>
             <w:tcW w:type="dxa" w:w="3744"/>
-            <w:shd w:val="clear" w:color="auto" w:fill="FFFFFF"/>
-          </w:tcPr>
-          <w:p>
-            <w:r>
-              <w:rPr>
-                <w:color w:val="595959"/>
-                <w:sz w:val="18"/>
-              </w:rPr>
-              <w:t>rg-alz-conn-germanywestcentral</w:t>
-            </w:r>
-          </w:p>
-        </w:tc>
-      </w:tr>
-      <w:tr>
-        <w:tc>
-          <w:tcPr>
-            <w:tcW w:type="dxa" w:w="4320"/>
-            <w:shd w:val="clear" w:color="auto" w:fill="F2F9F5"/>
-          </w:tcPr>
-          <w:p>
-            <w:r>
-              <w:rPr>
-                <w:color w:val="595959"/>
-                <w:sz w:val="18"/>
-              </w:rPr>
-              <w:t>afw-alz-germanywestcentral</w:t>
-            </w:r>
-          </w:p>
-        </w:tc>
-        <w:tc>
-          <w:tcPr>
-            <w:tcW w:type="dxa" w:w="2592"/>
-            <w:shd w:val="clear" w:color="auto" w:fill="F2F9F5"/>
-          </w:tcPr>
-          <w:p>
-            <w:r>
-              <w:rPr>
-                <w:color w:val="595959"/>
-                <w:sz w:val="18"/>
-              </w:rPr>
-              <w:t>Azure Firewall</w:t>
-            </w:r>
-          </w:p>
-        </w:tc>
-        <w:tc>
-          <w:tcPr>
-            <w:tcW w:type="dxa" w:w="864"/>
-            <w:shd w:val="clear" w:color="auto" w:fill="F2F9F5"/>
-          </w:tcPr>
-          <w:p>
-            <w:r>
-              <w:rPr>
-                <w:color w:val="595959"/>
-                <w:sz w:val="18"/>
-              </w:rPr>
-              <w:t>GWC</w:t>
-            </w:r>
-          </w:p>
-        </w:tc>
-        <w:tc>
-          <w:tcPr>
-            <w:tcW w:type="dxa" w:w="3744"/>
-            <w:shd w:val="clear" w:color="auto" w:fill="F2F9F5"/>
-          </w:tcPr>
-          <w:p>
-            <w:r>
-              <w:rPr>
-                <w:color w:val="595959"/>
-                <w:sz w:val="18"/>
-              </w:rPr>
-              <w:t>rg-alz-conn-germanywestcentral</w:t>
-            </w:r>
-          </w:p>
-        </w:tc>
-      </w:tr>
-      <w:tr>
-        <w:tc>
-          <w:tcPr>
-            <w:tcW w:type="dxa" w:w="4320"/>
-            <w:shd w:val="clear" w:color="auto" w:fill="FFFFFF"/>
-          </w:tcPr>
-          <w:p>
-            <w:r>
-              <w:rPr>
-                <w:color w:val="595959"/>
-                <w:sz w:val="18"/>
-              </w:rPr>
-              <w:t>afwp-alz-germanywestcentral</w:t>
-            </w:r>
-          </w:p>
-        </w:tc>
-        <w:tc>
-          <w:tcPr>
-            <w:tcW w:type="dxa" w:w="2592"/>
-            <w:shd w:val="clear" w:color="auto" w:fill="FFFFFF"/>
-          </w:tcPr>
-          <w:p>
-            <w:r>
-              <w:rPr>
-                <w:color w:val="595959"/>
-                <w:sz w:val="18"/>
-              </w:rPr>
-              <w:t>Firewall Policy</w:t>
-            </w:r>
-          </w:p>
-        </w:tc>
-        <w:tc>
-          <w:tcPr>
-            <w:tcW w:type="dxa" w:w="864"/>
-            <w:shd w:val="clear" w:color="auto" w:fill="FFFFFF"/>
-          </w:tcPr>
-          <w:p>
-            <w:r>
-              <w:rPr>
-                <w:color w:val="595959"/>
-                <w:sz w:val="18"/>
-              </w:rPr>
-              <w:t>GWC</w:t>
-            </w:r>
-          </w:p>
-        </w:tc>
-        <w:tc>
-          <w:tcPr>
-            <w:tcW w:type="dxa" w:w="3744"/>
-            <w:shd w:val="clear" w:color="auto" w:fill="FFFFFF"/>
-          </w:tcPr>
-          <w:p>
-            <w:r>
-              <w:rPr>
-                <w:color w:val="595959"/>
-                <w:sz w:val="18"/>
-              </w:rPr>
-              <w:t>rg-alz-conn-germanywestcentral</w:t>
-            </w:r>
-          </w:p>
-        </w:tc>
-      </w:tr>
-      <w:tr>
-        <w:tc>
-          <w:tcPr>
-            <w:tcW w:type="dxa" w:w="4320"/>
-            <w:shd w:val="clear" w:color="auto" w:fill="F2F9F5"/>
-          </w:tcPr>
-          <w:p>
-            <w:r>
-              <w:rPr>
-                <w:color w:val="595959"/>
-                <w:sz w:val="18"/>
-              </w:rPr>
-              <w:t>pip-afw-alz-germanywestcentral</w:t>
-            </w:r>
-          </w:p>
-        </w:tc>
-        <w:tc>
-          <w:tcPr>
-            <w:tcW w:type="dxa" w:w="2592"/>
-            <w:shd w:val="clear" w:color="auto" w:fill="F2F9F5"/>
-          </w:tcPr>
-          <w:p>
-            <w:r>
-              <w:rPr>
-                <w:color w:val="595959"/>
-                <w:sz w:val="18"/>
-              </w:rPr>
-              <w:t>Public IP (Firewall)</w:t>
-            </w:r>
-          </w:p>
-        </w:tc>
-        <w:tc>
-          <w:tcPr>
-            <w:tcW w:type="dxa" w:w="864"/>
-            <w:shd w:val="clear" w:color="auto" w:fill="F2F9F5"/>
-          </w:tcPr>
-          <w:p>
-            <w:r>
-              <w:rPr>
-                <w:color w:val="595959"/>
-                <w:sz w:val="18"/>
-              </w:rPr>
-              <w:t>GWC</w:t>
-            </w:r>
-          </w:p>
-        </w:tc>
-        <w:tc>
-          <w:tcPr>
-            <w:tcW w:type="dxa" w:w="3744"/>
-            <w:shd w:val="clear" w:color="auto" w:fill="F2F9F5"/>
-          </w:tcPr>
-          <w:p>
-            <w:r>
-              <w:rPr>
-                <w:color w:val="595959"/>
-                <w:sz w:val="18"/>
-              </w:rPr>
-              <w:t>rg-alz-conn-germanywestcentral</w:t>
-            </w:r>
-          </w:p>
-        </w:tc>
-      </w:tr>
-      <w:tr>
-        <w:tc>
-          <w:tcPr>
-            <w:tcW w:type="dxa" w:w="4320"/>
-            <w:shd w:val="clear" w:color="auto" w:fill="FFFFFF"/>
-          </w:tcPr>
-          <w:p>
-            <w:r>
-              <w:rPr>
-                <w:color w:val="595959"/>
-                <w:sz w:val="18"/>
-              </w:rPr>
-              <w:t>pip-afw-mgmt-alz-germanywestcentral</w:t>
-            </w:r>
-          </w:p>
-        </w:tc>
-        <w:tc>
-          <w:tcPr>
-            <w:tcW w:type="dxa" w:w="2592"/>
-            <w:shd w:val="clear" w:color="auto" w:fill="FFFFFF"/>
-          </w:tcPr>
-          <w:p>
-            <w:r>
-              <w:rPr>
-                <w:color w:val="595959"/>
-                <w:sz w:val="18"/>
-              </w:rPr>
-              <w:t>Public IP (FW Mgmt)</w:t>
-            </w:r>
-          </w:p>
-        </w:tc>
-        <w:tc>
-          <w:tcPr>
-            <w:tcW w:type="dxa" w:w="864"/>
-            <w:shd w:val="clear" w:color="auto" w:fill="FFFFFF"/>
-          </w:tcPr>
-          <w:p>
-            <w:r>
-              <w:rPr>
-                <w:color w:val="595959"/>
-                <w:sz w:val="18"/>
-              </w:rPr>
-              <w:t>GWC</w:t>
-            </w:r>
-          </w:p>
-        </w:tc>
-        <w:tc>
-          <w:tcPr>
-            <w:tcW w:type="dxa" w:w="3744"/>
-            <w:shd w:val="clear" w:color="auto" w:fill="FFFFFF"/>
-          </w:tcPr>
-          <w:p>
-            <w:r>
-              <w:rPr>
-                <w:color w:val="595959"/>
-                <w:sz w:val="18"/>
-              </w:rPr>
-              <w:t>rg-alz-conn-germanywestcentral</w:t>
-            </w:r>
-          </w:p>
-        </w:tc>
-      </w:tr>
-      <w:tr>
-        <w:tc>
-          <w:tcPr>
-            <w:tcW w:type="dxa" w:w="4320"/>
-            <w:shd w:val="clear" w:color="auto" w:fill="F2F9F5"/>
-          </w:tcPr>
-          <w:p>
-            <w:r>
-              <w:rPr>
-                <w:color w:val="595959"/>
-                <w:sz w:val="18"/>
-              </w:rPr>
-              <w:t>bas-alz-germanywestcentral</w:t>
-            </w:r>
-          </w:p>
-        </w:tc>
-        <w:tc>
-          <w:tcPr>
-            <w:tcW w:type="dxa" w:w="2592"/>
-            <w:shd w:val="clear" w:color="auto" w:fill="F2F9F5"/>
-          </w:tcPr>
-          <w:p>
-            <w:r>
-              <w:rPr>
-                <w:color w:val="595959"/>
-                <w:sz w:val="18"/>
-              </w:rPr>
-              <w:t>Azure Bastion (Zurückgestellt)</w:t>
-            </w:r>
-          </w:p>
-        </w:tc>
-        <w:tc>
-          <w:tcPr>
-            <w:tcW w:type="dxa" w:w="864"/>
-            <w:shd w:val="clear" w:color="auto" w:fill="F2F9F5"/>
-          </w:tcPr>
-          <w:p>
-            <w:r>
-              <w:rPr>
-                <w:color w:val="595959"/>
-                <w:sz w:val="18"/>
-              </w:rPr>
-              <w:t>GWC</w:t>
-            </w:r>
-          </w:p>
-        </w:tc>
-        <w:tc>
-          <w:tcPr>
-            <w:tcW w:type="dxa" w:w="3744"/>
-            <w:shd w:val="clear" w:color="auto" w:fill="F2F9F5"/>
-          </w:tcPr>
-          <w:p>
-            <w:r>
-              <w:rPr>
-                <w:color w:val="595959"/>
-                <w:sz w:val="18"/>
-              </w:rPr>
-              <w:t>rg-alz-conn-germanywestcentral</w:t>
-            </w:r>
-          </w:p>
-        </w:tc>
-      </w:tr>
-      <w:tr>
-        <w:tc>
-          <w:tcPr>
-            <w:tcW w:type="dxa" w:w="4320"/>
-            <w:shd w:val="clear" w:color="auto" w:fill="FFFFFF"/>
-          </w:tcPr>
-          <w:p>
-            <w:r>
-              <w:rPr>
-                <w:color w:val="595959"/>
-                <w:sz w:val="18"/>
-              </w:rPr>
-              <w:t>vpngw-alz-germanywestcentral</w:t>
-            </w:r>
-          </w:p>
-        </w:tc>
-        <w:tc>
-          <w:tcPr>
-            <w:tcW w:type="dxa" w:w="2592"/>
-            <w:shd w:val="clear" w:color="auto" w:fill="FFFFFF"/>
-          </w:tcPr>
-          <w:p>
-            <w:r>
-              <w:rPr>
-                <w:color w:val="595959"/>
-                <w:sz w:val="18"/>
-              </w:rPr>
-              <w:t>VPN Gateway (Zurückgestellt)</w:t>
-            </w:r>
-          </w:p>
-        </w:tc>
-        <w:tc>
-          <w:tcPr>
-            <w:tcW w:type="dxa" w:w="864"/>
-            <w:shd w:val="clear" w:color="auto" w:fill="FFFFFF"/>
-          </w:tcPr>
-          <w:p>
-            <w:r>
-              <w:rPr>
-                <w:color w:val="595959"/>
-                <w:sz w:val="18"/>
-              </w:rPr>
-              <w:t>GWC</w:t>
-            </w:r>
-          </w:p>
-        </w:tc>
-        <w:tc>
-          <w:tcPr>
-            <w:tcW w:type="dxa" w:w="3744"/>
-            <w:shd w:val="clear" w:color="auto" w:fill="FFFFFF"/>
-          </w:tcPr>
-          <w:p>
-            <w:r>
-              <w:rPr>
-                <w:color w:val="595959"/>
-                <w:sz w:val="18"/>
-              </w:rPr>
-              <w:t>rg-alz-conn-germanywestcentral</w:t>
-            </w:r>
-          </w:p>
-        </w:tc>
-      </w:tr>
-      <w:tr>
-        <w:tc>
-          <w:tcPr>
-            <w:tcW w:type="dxa" w:w="4320"/>
-            <w:shd w:val="clear" w:color="auto" w:fill="F2F9F5"/>
-          </w:tcPr>
-          <w:p>
-            <w:r>
-              <w:rPr>
-                <w:color w:val="595959"/>
-                <w:sz w:val="18"/>
-              </w:rPr>
-              <w:t>dnspr-alz-germanywestcentral</w:t>
-            </w:r>
-          </w:p>
-        </w:tc>
-        <w:tc>
-          <w:tcPr>
-            <w:tcW w:type="dxa" w:w="2592"/>
-            <w:shd w:val="clear" w:color="auto" w:fill="F2F9F5"/>
-          </w:tcPr>
-          <w:p>
-            <w:r>
-              <w:rPr>
-                <w:color w:val="595959"/>
-                <w:sz w:val="18"/>
-              </w:rPr>
-              <w:t>DNS Private Resolver (Zurückgestellt)</w:t>
-            </w:r>
-          </w:p>
-        </w:tc>
-        <w:tc>
-          <w:tcPr>
-            <w:tcW w:type="dxa" w:w="864"/>
-            <w:shd w:val="clear" w:color="auto" w:fill="F2F9F5"/>
-          </w:tcPr>
-          <w:p>
-            <w:r>
-              <w:rPr>
-                <w:color w:val="595959"/>
-                <w:sz w:val="18"/>
-              </w:rPr>
-              <w:t>GWC</w:t>
-            </w:r>
-          </w:p>
-        </w:tc>
-        <w:tc>
-          <w:tcPr>
-            <w:tcW w:type="dxa" w:w="3744"/>
-            <w:shd w:val="clear" w:color="auto" w:fill="F2F9F5"/>
-          </w:tcPr>
-          <w:p>
-            <w:r>
-              <w:rPr>
-                <w:color w:val="595959"/>
-                <w:sz w:val="18"/>
-              </w:rPr>
-              <w:t>rg-alz-conn-germanywestcentral</w:t>
-            </w:r>
-          </w:p>
-        </w:tc>
-      </w:tr>
-      <w:tr>
-        <w:tc>
-          <w:tcPr>
-            <w:tcW w:type="dxa" w:w="4320"/>
-            <w:shd w:val="clear" w:color="auto" w:fill="FFFFFF"/>
-          </w:tcPr>
-          <w:p>
-            <w:r>
-              <w:rPr>
-                <w:color w:val="595959"/>
-                <w:sz w:val="18"/>
-              </w:rPr>
-              <w:t>privatelink.blob.core.windows.net (+ 58 weitere Zonen)</w:t>
-            </w:r>
-          </w:p>
-        </w:tc>
-        <w:tc>
-          <w:tcPr>
-            <w:tcW w:type="dxa" w:w="2592"/>
-            <w:shd w:val="clear" w:color="auto" w:fill="FFFFFF"/>
-          </w:tcPr>
-          <w:p>
-            <w:r>
-              <w:rPr>
-                <w:color w:val="595959"/>
-                <w:sz w:val="18"/>
-              </w:rPr>
-              <w:t>Private DNS Zones (59)</w:t>
-            </w:r>
-          </w:p>
-        </w:tc>
-        <w:tc>
-          <w:tcPr>
-            <w:tcW w:type="dxa" w:w="864"/>
-            <w:shd w:val="clear" w:color="auto" w:fill="FFFFFF"/>
-          </w:tcPr>
-          <w:p>
-            <w:r>
-              <w:rPr>
-                <w:color w:val="595959"/>
-                <w:sz w:val="18"/>
-              </w:rPr>
-              <w:t>GWC</w:t>
-            </w:r>
-          </w:p>
-        </w:tc>
-        <w:tc>
-          <w:tcPr>
-            <w:tcW w:type="dxa" w:w="3744"/>
-            <w:shd w:val="clear" w:color="auto" w:fill="FFFFFF"/>
+            <w:shd w:val="clear" w:color="auto" w:fill="F2F9F5"/>
           </w:tcPr>
           <w:p>
             <w:r>

</xml_diff>